<commit_message>
Update resume content to enhance clarity and detail in work experience descriptions
</commit_message>
<xml_diff>
--- a/public/assets/Nathan Zimmerman Resume.docx
+++ b/public/assets/Nathan Zimmerman Resume.docx
@@ -135,8 +135,8 @@
         </w:pBdr>
         <w:rPr>
           <w:rFonts w:ascii="Lato" w:eastAsia="Lato" w:hAnsi="Lato" w:cs="Lato"/>
-          <w:sz w:val="16"/>
-          <w:szCs w:val="16"/>
+          <w:sz w:val="12"/>
+          <w:szCs w:val="12"/>
         </w:rPr>
       </w:pPr>
     </w:p>
@@ -203,489 +203,148 @@
     </w:p>
     <w:p>
       <w:pPr>
+        <w:pStyle w:val="ListParagraph"/>
         <w:numPr>
           <w:ilvl w:val="0"/>
-          <w:numId w:val="5"/>
-        </w:numPr>
-        <w:pBdr>
-          <w:top w:val="nil"/>
-          <w:left w:val="nil"/>
-          <w:bottom w:val="nil"/>
-          <w:right w:val="nil"/>
-          <w:between w:val="nil"/>
-        </w:pBdr>
-        <w:spacing w:line="240" w:lineRule="auto"/>
-        <w:rPr>
-          <w:rFonts w:ascii="Lato" w:eastAsia="Lato" w:hAnsi="Lato" w:cs="Lato"/>
-          <w:color w:val="000000"/>
-        </w:rPr>
-      </w:pPr>
-      <w:r>
-        <w:rPr>
-          <w:rFonts w:ascii="Lato" w:eastAsia="Lato" w:hAnsi="Lato" w:cs="Lato"/>
-          <w:color w:val="000000"/>
-        </w:rPr>
-        <w:t xml:space="preserve">Contributed to a greenfield Payment Plans &amp; Billing domain for a multi-tenant </w:t>
-      </w:r>
-      <w:r>
-        <w:rPr>
-          <w:rFonts w:ascii="Lato" w:eastAsia="Lato" w:hAnsi="Lato" w:cs="Lato"/>
-          <w:color w:val="000000"/>
-        </w:rPr>
-        <w:t>platform</w:t>
-      </w:r>
-      <w:r>
-        <w:rPr>
-          <w:rFonts w:ascii="Lato" w:eastAsia="Lato" w:hAnsi="Lato" w:cs="Lato"/>
-          <w:color w:val="000000"/>
-        </w:rPr>
-        <w:t xml:space="preserve"> serving schools</w:t>
-      </w:r>
-      <w:r>
-        <w:rPr>
-          <w:rFonts w:ascii="Lato" w:eastAsia="Lato" w:hAnsi="Lato" w:cs="Lato"/>
-          <w:color w:val="000000"/>
-        </w:rPr>
-        <w:t xml:space="preserve">, built with C#/.NET microservices and Angular. </w:t>
-      </w:r>
-    </w:p>
-    <w:p>
-      <w:pPr>
-        <w:numPr>
-          <w:ilvl w:val="0"/>
-          <w:numId w:val="5"/>
-        </w:numPr>
-        <w:pBdr>
-          <w:top w:val="nil"/>
-          <w:left w:val="nil"/>
-          <w:bottom w:val="nil"/>
-          <w:right w:val="nil"/>
-          <w:between w:val="nil"/>
-        </w:pBdr>
-        <w:spacing w:line="240" w:lineRule="auto"/>
-        <w:rPr>
-          <w:rFonts w:ascii="Lato" w:eastAsia="Lato" w:hAnsi="Lato" w:cs="Lato"/>
-          <w:color w:val="000000"/>
-        </w:rPr>
-      </w:pPr>
-      <w:r>
-        <w:rPr>
-          <w:rFonts w:ascii="Lato" w:eastAsia="Lato" w:hAnsi="Lato" w:cs="Lato"/>
-          <w:color w:val="000000"/>
-        </w:rPr>
-        <w:t xml:space="preserve">Built a payment plan schedule calculator in </w:t>
-      </w:r>
-      <w:r>
-        <w:rPr>
-          <w:rFonts w:ascii="Lato" w:eastAsia="Lato" w:hAnsi="Lato" w:cs="Lato"/>
-          <w:color w:val="000000"/>
-        </w:rPr>
-        <w:t>the enrollment service</w:t>
-      </w:r>
-      <w:r>
-        <w:rPr>
-          <w:rFonts w:ascii="Lato" w:eastAsia="Lato" w:hAnsi="Lato" w:cs="Lato"/>
-          <w:color w:val="000000"/>
-        </w:rPr>
-        <w:t xml:space="preserve">. </w:t>
-      </w:r>
-      <w:r>
-        <w:rPr>
-          <w:rFonts w:ascii="Lato" w:eastAsia="Lato" w:hAnsi="Lato" w:cs="Lato"/>
-          <w:color w:val="000000"/>
-        </w:rPr>
-        <w:t>Generated installment</w:t>
-      </w:r>
-      <w:r>
-        <w:rPr>
-          <w:rFonts w:ascii="Lato" w:eastAsia="Lato" w:hAnsi="Lato" w:cs="Lato"/>
-          <w:color w:val="000000"/>
-        </w:rPr>
-        <w:t xml:space="preserve"> scenarios based on first-installment constraints, installment count, down payment, frequency (weekly/monthly), and completion date; wired results to an interactive Angular UI (sliders/inputs).</w:t>
-      </w:r>
-    </w:p>
-    <w:p>
-      <w:pPr>
-        <w:numPr>
-          <w:ilvl w:val="0"/>
-          <w:numId w:val="5"/>
-        </w:numPr>
-        <w:pBdr>
-          <w:top w:val="nil"/>
-          <w:left w:val="nil"/>
-          <w:bottom w:val="nil"/>
-          <w:right w:val="nil"/>
-          <w:between w:val="nil"/>
-        </w:pBdr>
-        <w:spacing w:line="240" w:lineRule="auto"/>
-        <w:rPr>
-          <w:rFonts w:ascii="Lato" w:eastAsia="Lato" w:hAnsi="Lato" w:cs="Lato"/>
-          <w:color w:val="000000"/>
-        </w:rPr>
-      </w:pPr>
-      <w:r>
-        <w:rPr>
-          <w:rFonts w:ascii="Lato" w:eastAsia="Lato" w:hAnsi="Lato" w:cs="Lato"/>
-          <w:color w:val="000000"/>
-        </w:rPr>
-        <w:t xml:space="preserve">Packaged the calculator as </w:t>
-      </w:r>
-      <w:r>
-        <w:rPr>
-          <w:rFonts w:ascii="Lato" w:eastAsia="Lato" w:hAnsi="Lato" w:cs="Lato"/>
-          <w:color w:val="000000"/>
-        </w:rPr>
-        <w:t>a</w:t>
-      </w:r>
-      <w:r>
-        <w:rPr>
-          <w:rFonts w:ascii="Lato" w:eastAsia="Lato" w:hAnsi="Lato" w:cs="Lato"/>
-          <w:color w:val="000000"/>
-        </w:rPr>
-        <w:t xml:space="preserve"> </w:t>
-      </w:r>
-      <w:proofErr w:type="spellStart"/>
-      <w:r>
-        <w:rPr>
-          <w:rFonts w:ascii="Lato" w:eastAsia="Lato" w:hAnsi="Lato" w:cs="Lato"/>
-          <w:color w:val="000000"/>
-        </w:rPr>
-        <w:t>npm</w:t>
-      </w:r>
-      <w:proofErr w:type="spellEnd"/>
-      <w:r>
-        <w:rPr>
-          <w:rFonts w:ascii="Lato" w:eastAsia="Lato" w:hAnsi="Lato" w:cs="Lato"/>
-          <w:color w:val="000000"/>
-        </w:rPr>
-        <w:t xml:space="preserve"> package and integrated it into </w:t>
-      </w:r>
-      <w:r>
-        <w:rPr>
-          <w:rFonts w:ascii="Lato" w:eastAsia="Lato" w:hAnsi="Lato" w:cs="Lato"/>
-          <w:color w:val="000000"/>
-        </w:rPr>
-        <w:t xml:space="preserve">the payment plans service </w:t>
-      </w:r>
-      <w:r>
-        <w:rPr>
-          <w:rFonts w:ascii="Lato" w:eastAsia="Lato" w:hAnsi="Lato" w:cs="Lato"/>
-          <w:color w:val="000000"/>
-        </w:rPr>
-        <w:t>for</w:t>
-      </w:r>
-      <w:r>
-        <w:rPr>
-          <w:rFonts w:ascii="Lato" w:eastAsia="Lato" w:hAnsi="Lato" w:cs="Lato"/>
-          <w:color w:val="000000"/>
-        </w:rPr>
-        <w:t xml:space="preserve"> </w:t>
-      </w:r>
-      <w:r>
-        <w:rPr>
-          <w:rFonts w:ascii="Lato" w:eastAsia="Lato" w:hAnsi="Lato" w:cs="Lato"/>
-          <w:color w:val="000000"/>
-        </w:rPr>
-        <w:t>admin preview</w:t>
-      </w:r>
-      <w:r>
-        <w:rPr>
-          <w:rFonts w:ascii="Lato" w:eastAsia="Lato" w:hAnsi="Lato" w:cs="Lato"/>
-          <w:color w:val="000000"/>
-        </w:rPr>
-        <w:t>.</w:t>
-      </w:r>
-    </w:p>
-    <w:p>
-      <w:pPr>
-        <w:numPr>
-          <w:ilvl w:val="0"/>
-          <w:numId w:val="5"/>
-        </w:numPr>
-        <w:pBdr>
-          <w:top w:val="nil"/>
-          <w:left w:val="nil"/>
-          <w:bottom w:val="nil"/>
-          <w:right w:val="nil"/>
-          <w:between w:val="nil"/>
-        </w:pBdr>
-        <w:spacing w:line="240" w:lineRule="auto"/>
-        <w:rPr>
-          <w:rFonts w:ascii="Lato" w:eastAsia="Lato" w:hAnsi="Lato" w:cs="Lato"/>
-          <w:color w:val="000000"/>
-        </w:rPr>
-      </w:pPr>
-      <w:r>
-        <w:rPr>
-          <w:rFonts w:ascii="Lato" w:eastAsia="Lato" w:hAnsi="Lato" w:cs="Lato"/>
-          <w:color w:val="000000"/>
-        </w:rPr>
-        <w:t>Subscribed to payments service for returned payments and added handlers in payment plans service to apply return policy actions (e.g., rescheduling installments or cancelling plans).</w:t>
-      </w:r>
-    </w:p>
-    <w:p>
-      <w:pPr>
-        <w:numPr>
-          <w:ilvl w:val="0"/>
-          <w:numId w:val="5"/>
-        </w:numPr>
-        <w:pBdr>
-          <w:top w:val="nil"/>
-          <w:left w:val="nil"/>
-          <w:bottom w:val="nil"/>
-          <w:right w:val="nil"/>
-          <w:between w:val="nil"/>
-        </w:pBdr>
-        <w:spacing w:line="240" w:lineRule="auto"/>
-        <w:rPr>
-          <w:rFonts w:ascii="Lato" w:eastAsia="Lato" w:hAnsi="Lato" w:cs="Lato"/>
-          <w:color w:val="000000"/>
-        </w:rPr>
-      </w:pPr>
-      <w:r>
-        <w:rPr>
-          <w:rFonts w:ascii="Lato" w:eastAsia="Lato" w:hAnsi="Lato" w:cs="Lato"/>
-          <w:color w:val="000000"/>
-        </w:rPr>
-        <w:t>Integrated with an internal correspondence service to trigger automated enrollment confirmation emails.</w:t>
-      </w:r>
-    </w:p>
-    <w:p>
-      <w:pPr>
-        <w:numPr>
-          <w:ilvl w:val="0"/>
-          <w:numId w:val="5"/>
-        </w:numPr>
-        <w:pBdr>
-          <w:top w:val="nil"/>
-          <w:left w:val="nil"/>
-          <w:bottom w:val="nil"/>
-          <w:right w:val="nil"/>
-          <w:between w:val="nil"/>
-        </w:pBdr>
-        <w:spacing w:line="240" w:lineRule="auto"/>
-        <w:rPr>
-          <w:rFonts w:ascii="Lato" w:eastAsia="Lato" w:hAnsi="Lato" w:cs="Lato"/>
-          <w:color w:val="000000"/>
-        </w:rPr>
-      </w:pPr>
-      <w:r>
-        <w:rPr>
-          <w:rFonts w:ascii="Lato" w:eastAsia="Lato" w:hAnsi="Lato" w:cs="Lato"/>
-          <w:color w:val="000000"/>
-        </w:rPr>
-        <w:t>Implemented runtime payment plan status calculation from persisted confirmation/start/end timestamps to keep UI state accurate without storing status in the database.</w:t>
-      </w:r>
-    </w:p>
-    <w:p>
-      <w:pPr>
-        <w:numPr>
-          <w:ilvl w:val="0"/>
-          <w:numId w:val="5"/>
-        </w:numPr>
-        <w:pBdr>
-          <w:top w:val="nil"/>
-          <w:left w:val="nil"/>
-          <w:bottom w:val="nil"/>
-          <w:right w:val="nil"/>
-          <w:between w:val="nil"/>
-        </w:pBdr>
-        <w:spacing w:line="240" w:lineRule="auto"/>
-        <w:rPr>
-          <w:rFonts w:ascii="Lato" w:eastAsia="Lato" w:hAnsi="Lato" w:cs="Lato"/>
-          <w:color w:val="000000"/>
-        </w:rPr>
-      </w:pPr>
-      <w:r>
-        <w:rPr>
-          <w:rFonts w:ascii="Lato" w:eastAsia="Lato" w:hAnsi="Lato" w:cs="Lato"/>
-          <w:color w:val="000000"/>
-        </w:rPr>
-        <w:t xml:space="preserve">Improved data quality by expanding </w:t>
-      </w:r>
-      <w:proofErr w:type="spellStart"/>
-      <w:r>
-        <w:rPr>
-          <w:rFonts w:ascii="Lato" w:eastAsia="Lato" w:hAnsi="Lato" w:cs="Lato"/>
-          <w:color w:val="000000"/>
-        </w:rPr>
-        <w:t>FluentValidation</w:t>
-      </w:r>
-      <w:proofErr w:type="spellEnd"/>
-      <w:r>
-        <w:rPr>
-          <w:rFonts w:ascii="Lato" w:eastAsia="Lato" w:hAnsi="Lato" w:cs="Lato"/>
-          <w:color w:val="000000"/>
-        </w:rPr>
-        <w:t xml:space="preserve"> rules and adding unit/integration tests </w:t>
-      </w:r>
-      <w:proofErr w:type="spellStart"/>
-      <w:r>
-        <w:rPr>
-          <w:rFonts w:ascii="Lato" w:eastAsia="Lato" w:hAnsi="Lato" w:cs="Lato"/>
-          <w:color w:val="000000"/>
-        </w:rPr>
-        <w:t>xUnit</w:t>
-      </w:r>
-      <w:proofErr w:type="spellEnd"/>
-      <w:r>
-        <w:rPr>
-          <w:rFonts w:ascii="Lato" w:eastAsia="Lato" w:hAnsi="Lato" w:cs="Lato"/>
-          <w:color w:val="000000"/>
-        </w:rPr>
-        <w:t xml:space="preserve"> and </w:t>
-      </w:r>
-      <w:proofErr w:type="spellStart"/>
-      <w:r>
-        <w:rPr>
-          <w:rFonts w:ascii="Lato" w:eastAsia="Lato" w:hAnsi="Lato" w:cs="Lato"/>
-          <w:color w:val="000000"/>
-        </w:rPr>
-        <w:t>Moq</w:t>
-      </w:r>
-      <w:proofErr w:type="spellEnd"/>
-      <w:r>
-        <w:rPr>
-          <w:rFonts w:ascii="Lato" w:eastAsia="Lato" w:hAnsi="Lato" w:cs="Lato"/>
-          <w:color w:val="000000"/>
-        </w:rPr>
-        <w:t>.</w:t>
-      </w:r>
-    </w:p>
-    <w:p>
-      <w:pPr>
-        <w:tabs>
-          <w:tab w:val="right" w:pos="11250"/>
-        </w:tabs>
-        <w:rPr>
-          <w:rFonts w:ascii="Lato" w:eastAsia="Lato" w:hAnsi="Lato" w:cs="Lato"/>
-          <w:sz w:val="16"/>
-          <w:szCs w:val="16"/>
-        </w:rPr>
-      </w:pPr>
-    </w:p>
-    <w:p>
-      <w:pPr>
-        <w:tabs>
-          <w:tab w:val="right" w:pos="11250"/>
-        </w:tabs>
-        <w:rPr>
-          <w:rFonts w:ascii="Lato" w:eastAsia="Lato" w:hAnsi="Lato" w:cs="Lato"/>
-        </w:rPr>
-      </w:pPr>
-      <w:r>
-        <w:rPr>
-          <w:rFonts w:ascii="Lato" w:eastAsia="Lato" w:hAnsi="Lato" w:cs="Lato"/>
-          <w:b/>
-          <w:bCs/>
-        </w:rPr>
-        <w:t>Software Development Engineer</w:t>
-      </w:r>
-      <w:r>
-        <w:rPr>
-          <w:rFonts w:ascii="Lato" w:eastAsia="Lato" w:hAnsi="Lato" w:cs="Lato"/>
-        </w:rPr>
-        <w:t>, Amazon</w:t>
-      </w:r>
-      <w:r>
-        <w:rPr>
-          <w:rFonts w:ascii="Lato" w:eastAsia="Lato" w:hAnsi="Lato" w:cs="Lato"/>
-        </w:rPr>
-        <w:tab/>
-        <w:t>05/2022 – 04/2023</w:t>
-      </w:r>
-    </w:p>
-    <w:p>
-      <w:pPr>
-        <w:numPr>
-          <w:ilvl w:val="0"/>
-          <w:numId w:val="3"/>
+          <w:numId w:val="13"/>
         </w:numPr>
         <w:tabs>
           <w:tab w:val="right" w:pos="11250"/>
         </w:tabs>
         <w:rPr>
-          <w:rFonts w:ascii="Lato" w:eastAsia="Lato" w:hAnsi="Lato" w:cs="Lato"/>
-        </w:rPr>
-      </w:pPr>
-      <w:r>
-        <w:rPr>
-          <w:rFonts w:ascii="Lato" w:eastAsia="Lato" w:hAnsi="Lato" w:cs="Lato"/>
-        </w:rPr>
-        <w:t>Engineered risk guidance applications using Java, Scala, Spring, and AWS to screen third-party sellers against denied party lists, predicting financial offenses such as money laundering.</w:t>
+          <w:rFonts w:ascii="Lato" w:eastAsia="Times New Roman" w:hAnsi="Lato" w:cs="Times New Roman"/>
+          <w:lang w:val="en-US"/>
+        </w:rPr>
+      </w:pPr>
+      <w:r>
+        <w:rPr>
+          <w:rFonts w:ascii="Lato" w:eastAsia="Times New Roman" w:hAnsi="Lato" w:cs="Times New Roman"/>
+          <w:lang w:val="en-US"/>
+        </w:rPr>
+        <w:t xml:space="preserve">Built core features within a greenfield Payment Plans &amp; Billing domain for a multi-tenant SaaS platform serving educational institutions, spanning C#/.NET microservices, Angular, MongoDB, and </w:t>
+      </w:r>
+      <w:r>
+        <w:rPr>
+          <w:rFonts w:ascii="Lato" w:eastAsia="Times New Roman" w:hAnsi="Lato" w:cs="Times New Roman"/>
+          <w:lang w:val="en-US"/>
+        </w:rPr>
+        <w:t>shared service integrations.</w:t>
       </w:r>
     </w:p>
     <w:p>
       <w:pPr>
+        <w:pStyle w:val="ListParagraph"/>
         <w:numPr>
           <w:ilvl w:val="0"/>
-          <w:numId w:val="3"/>
+          <w:numId w:val="13"/>
         </w:numPr>
         <w:tabs>
           <w:tab w:val="right" w:pos="11250"/>
         </w:tabs>
         <w:rPr>
-          <w:rFonts w:ascii="Lato" w:eastAsia="Lato" w:hAnsi="Lato" w:cs="Lato"/>
-        </w:rPr>
-      </w:pPr>
-      <w:r>
-        <w:rPr>
-          <w:rFonts w:ascii="Lato" w:eastAsia="Lato" w:hAnsi="Lato" w:cs="Lato"/>
-        </w:rPr>
-        <w:t>Remediated critical security issues by enabling encryption (SQS/SNS/S3 via KMS), tightening IAM policies to least privilege, and upgrading dependencies to address vulnerabilities.</w:t>
+          <w:rFonts w:ascii="Lato" w:eastAsia="Times New Roman" w:hAnsi="Lato" w:cs="Times New Roman"/>
+          <w:lang w:val="en-US"/>
+        </w:rPr>
+      </w:pPr>
+      <w:r>
+        <w:rPr>
+          <w:rFonts w:ascii="Lato" w:eastAsia="Times New Roman" w:hAnsi="Lato" w:cs="Times New Roman"/>
+          <w:lang w:val="en-US"/>
+        </w:rPr>
+        <w:t>Designed payment plan offering and enrollment workflows across admin and payer-facing apps, supporting plan setup, payment rules, schedule scenarios, disclosures, and final enrollment.</w:t>
       </w:r>
     </w:p>
     <w:p>
       <w:pPr>
+        <w:pStyle w:val="ListParagraph"/>
         <w:numPr>
           <w:ilvl w:val="0"/>
-          <w:numId w:val="3"/>
+          <w:numId w:val="13"/>
         </w:numPr>
         <w:tabs>
           <w:tab w:val="right" w:pos="11250"/>
         </w:tabs>
         <w:rPr>
-          <w:rFonts w:ascii="Lato" w:eastAsia="Lato" w:hAnsi="Lato" w:cs="Lato"/>
-        </w:rPr>
-      </w:pPr>
-      <w:r>
-        <w:rPr>
-          <w:rFonts w:ascii="Lato" w:eastAsia="Lato" w:hAnsi="Lato" w:cs="Lato"/>
-        </w:rPr>
-        <w:t>Performed EC2 host migrations across IAD/PDX Availability Zones for 10+ applications and 100+ environments, validating cutovers with alarms/dashboards to ensure zero downtime.</w:t>
+          <w:rFonts w:ascii="Lato" w:eastAsia="Times New Roman" w:hAnsi="Lato" w:cs="Times New Roman"/>
+          <w:lang w:val="en-US"/>
+        </w:rPr>
+      </w:pPr>
+      <w:r>
+        <w:rPr>
+          <w:rFonts w:ascii="Lato" w:eastAsia="Times New Roman" w:hAnsi="Lato" w:cs="Times New Roman"/>
+          <w:lang w:val="en-US"/>
+        </w:rPr>
+        <w:t>Developed a reusable payment schedule calculator packaged as a shared Angular/</w:t>
+      </w:r>
+      <w:proofErr w:type="spellStart"/>
+      <w:r>
+        <w:rPr>
+          <w:rFonts w:ascii="Lato" w:eastAsia="Times New Roman" w:hAnsi="Lato" w:cs="Times New Roman"/>
+          <w:lang w:val="en-US"/>
+        </w:rPr>
+        <w:t>npm</w:t>
+      </w:r>
+      <w:proofErr w:type="spellEnd"/>
+      <w:r>
+        <w:rPr>
+          <w:rFonts w:ascii="Lato" w:eastAsia="Times New Roman" w:hAnsi="Lato" w:cs="Times New Roman"/>
+          <w:lang w:val="en-US"/>
+        </w:rPr>
+        <w:t xml:space="preserve"> component, generating installment scenarios from rules around down payments, cadence, fees, and completion dates.</w:t>
       </w:r>
     </w:p>
     <w:p>
       <w:pPr>
+        <w:pStyle w:val="ListParagraph"/>
         <w:numPr>
           <w:ilvl w:val="0"/>
-          <w:numId w:val="3"/>
+          <w:numId w:val="13"/>
         </w:numPr>
         <w:tabs>
           <w:tab w:val="right" w:pos="11250"/>
         </w:tabs>
         <w:rPr>
-          <w:rFonts w:ascii="Lato" w:eastAsia="Lato" w:hAnsi="Lato" w:cs="Lato"/>
-        </w:rPr>
-      </w:pPr>
-      <w:r>
-        <w:rPr>
-          <w:rFonts w:ascii="Lato" w:eastAsia="Lato" w:hAnsi="Lato" w:cs="Lato"/>
-        </w:rPr>
-        <w:t>Reduced support ticket volume by resolving pipeline failures, monitoring alarms, and fixing deployment errors.</w:t>
+          <w:rFonts w:ascii="Lato" w:eastAsia="Times New Roman" w:hAnsi="Lato" w:cs="Times New Roman"/>
+          <w:lang w:val="en-US"/>
+        </w:rPr>
+      </w:pPr>
+      <w:r>
+        <w:rPr>
+          <w:rFonts w:ascii="Lato" w:eastAsia="Times New Roman" w:hAnsi="Lato" w:cs="Times New Roman"/>
+          <w:lang w:val="en-US"/>
+        </w:rPr>
+        <w:t xml:space="preserve">Integrated payment, banking, disclosure, pricing, and messaging services to support payment method selection, disclosure rendering, enrollment confirmations, and </w:t>
+      </w:r>
+      <w:r>
+        <w:rPr>
+          <w:rFonts w:ascii="Lato" w:eastAsia="Times New Roman" w:hAnsi="Lato" w:cs="Times New Roman"/>
+          <w:lang w:val="en-US"/>
+        </w:rPr>
+        <w:t>payment plan lifecycle updates.</w:t>
       </w:r>
     </w:p>
     <w:p>
       <w:pPr>
+        <w:pStyle w:val="ListParagraph"/>
+        <w:numPr>
+          <w:ilvl w:val="0"/>
+          <w:numId w:val="13"/>
+        </w:numPr>
         <w:tabs>
           <w:tab w:val="right" w:pos="11250"/>
         </w:tabs>
         <w:rPr>
-          <w:rFonts w:ascii="Lato" w:eastAsia="Lato" w:hAnsi="Lato" w:cs="Lato"/>
-          <w:sz w:val="16"/>
-          <w:szCs w:val="16"/>
-        </w:rPr>
-      </w:pPr>
+          <w:rFonts w:ascii="Lato" w:eastAsia="Times New Roman" w:hAnsi="Lato" w:cs="Times New Roman"/>
+          <w:lang w:val="en-US"/>
+        </w:rPr>
+      </w:pPr>
+      <w:r>
+        <w:rPr>
+          <w:rFonts w:ascii="Lato" w:eastAsia="Times New Roman" w:hAnsi="Lato" w:cs="Times New Roman"/>
+          <w:lang w:val="en-US"/>
+        </w:rPr>
+        <w:t>Built event-driven returned-payment handling that applied return policy actions including installment rescheduling, failed-payment handling, plan cancellation, and runtime status derivation.</w:t>
+      </w:r>
     </w:p>
     <w:p>
       <w:pPr>
@@ -693,143 +352,257 @@
           <w:tab w:val="right" w:pos="11250"/>
         </w:tabs>
         <w:rPr>
-          <w:rFonts w:ascii="Lato" w:eastAsia="Lato" w:hAnsi="Lato" w:cs="Lato"/>
-        </w:rPr>
-      </w:pPr>
-      <w:r>
-        <w:rPr>
-          <w:rFonts w:ascii="Lato" w:eastAsia="Lato" w:hAnsi="Lato" w:cs="Lato"/>
-          <w:b/>
-          <w:bCs/>
-        </w:rPr>
-        <w:t>Software Developer</w:t>
-      </w:r>
-      <w:r>
-        <w:rPr>
-          <w:rFonts w:ascii="Lato" w:eastAsia="Lato" w:hAnsi="Lato" w:cs="Lato"/>
-        </w:rPr>
-        <w:t>, Radian Group Inc.</w:t>
-      </w:r>
-      <w:r>
-        <w:rPr>
-          <w:rFonts w:ascii="Lato" w:eastAsia="Lato" w:hAnsi="Lato" w:cs="Lato"/>
-        </w:rPr>
-        <w:tab/>
-        <w:t>09/2019 – 04/2022</w:t>
-      </w:r>
+          <w:rFonts w:ascii="Lato" w:eastAsia="Times New Roman" w:hAnsi="Lato" w:cs="Times New Roman"/>
+          <w:sz w:val="12"/>
+          <w:szCs w:val="12"/>
+          <w:lang w:val="en-US"/>
+        </w:rPr>
+      </w:pPr>
     </w:p>
     <w:p>
       <w:pPr>
-        <w:numPr>
-          <w:ilvl w:val="0"/>
-          <w:numId w:val="2"/>
-        </w:numPr>
-        <w:pBdr>
-          <w:top w:val="nil"/>
-          <w:left w:val="nil"/>
-          <w:bottom w:val="nil"/>
-          <w:right w:val="nil"/>
-          <w:between w:val="nil"/>
-        </w:pBdr>
         <w:tabs>
           <w:tab w:val="right" w:pos="11250"/>
         </w:tabs>
         <w:rPr>
           <w:rFonts w:ascii="Lato" w:eastAsia="Lato" w:hAnsi="Lato" w:cs="Lato"/>
-          <w:color w:val="000000"/>
-        </w:rPr>
-      </w:pPr>
-      <w:r>
-        <w:rPr>
-          <w:rFonts w:ascii="Lato" w:eastAsia="Lato" w:hAnsi="Lato" w:cs="Lato"/>
-          <w:color w:val="000000"/>
-        </w:rPr>
-        <w:t>Contributed to launch and maintenance of “</w:t>
-      </w:r>
-      <w:proofErr w:type="spellStart"/>
-      <w:r>
-        <w:rPr>
-          <w:rFonts w:ascii="Lato" w:eastAsia="Lato" w:hAnsi="Lato" w:cs="Lato"/>
-          <w:color w:val="000000"/>
-        </w:rPr>
-        <w:t>MyRadian</w:t>
-      </w:r>
-      <w:proofErr w:type="spellEnd"/>
-      <w:r>
-        <w:rPr>
-          <w:rFonts w:ascii="Lato" w:eastAsia="Lato" w:hAnsi="Lato" w:cs="Lato"/>
-          <w:color w:val="000000"/>
-        </w:rPr>
-        <w:t>,” a React + Node.js suite for Valuation and Asset Management Services, supporting feature delivery through code reviews, bug fixes, and production support.</w:t>
+        </w:rPr>
+      </w:pPr>
+      <w:r>
+        <w:rPr>
+          <w:rFonts w:ascii="Lato" w:eastAsia="Lato" w:hAnsi="Lato" w:cs="Lato"/>
+          <w:b/>
+          <w:bCs/>
+        </w:rPr>
+        <w:t>Software Development Engineer</w:t>
+      </w:r>
+      <w:r>
+        <w:rPr>
+          <w:rFonts w:ascii="Lato" w:eastAsia="Lato" w:hAnsi="Lato" w:cs="Lato"/>
+        </w:rPr>
+        <w:t>, Amazon</w:t>
+      </w:r>
+      <w:r>
+        <w:rPr>
+          <w:rFonts w:ascii="Lato" w:eastAsia="Lato" w:hAnsi="Lato" w:cs="Lato"/>
+        </w:rPr>
+        <w:tab/>
+        <w:t>05/2022 – 04/2023</w:t>
       </w:r>
     </w:p>
     <w:p>
       <w:pPr>
+        <w:pStyle w:val="ListParagraph"/>
         <w:numPr>
           <w:ilvl w:val="0"/>
-          <w:numId w:val="2"/>
+          <w:numId w:val="8"/>
         </w:numPr>
-        <w:pBdr>
-          <w:top w:val="nil"/>
-          <w:left w:val="nil"/>
-          <w:bottom w:val="nil"/>
-          <w:right w:val="nil"/>
-          <w:between w:val="nil"/>
-        </w:pBdr>
         <w:tabs>
           <w:tab w:val="right" w:pos="11250"/>
         </w:tabs>
         <w:rPr>
           <w:rFonts w:ascii="Lato" w:eastAsia="Lato" w:hAnsi="Lato" w:cs="Lato"/>
-          <w:color w:val="000000"/>
-        </w:rPr>
-      </w:pPr>
-      <w:r>
-        <w:rPr>
-          <w:rFonts w:ascii="Lato" w:eastAsia="Lato" w:hAnsi="Lato" w:cs="Lato"/>
-          <w:color w:val="000000"/>
-        </w:rPr>
-        <w:t>Troubleshot production issues and improved performance using AWS (CloudWatch, X-Ray, DynamoDB); maintained legacy C#/.NET and Java apps, resolving customer issues with Splunk and SQL.</w:t>
+        </w:rPr>
+      </w:pPr>
+      <w:r>
+        <w:rPr>
+          <w:rFonts w:ascii="Lato" w:hAnsi="Lato"/>
+        </w:rPr>
+        <w:t>Engineered risk-guidance applications using Java, Scala, Spring, and AWS to screen third-party sellers against denied-party lists and financial crime risk signals, including money-laundering indicators.</w:t>
       </w:r>
     </w:p>
     <w:p>
       <w:pPr>
+        <w:pStyle w:val="ListParagraph"/>
         <w:numPr>
           <w:ilvl w:val="0"/>
-          <w:numId w:val="2"/>
+          <w:numId w:val="8"/>
         </w:numPr>
-        <w:pBdr>
-          <w:top w:val="nil"/>
-          <w:left w:val="nil"/>
-          <w:bottom w:val="nil"/>
-          <w:right w:val="nil"/>
-          <w:between w:val="nil"/>
-        </w:pBdr>
         <w:tabs>
           <w:tab w:val="right" w:pos="11250"/>
         </w:tabs>
         <w:rPr>
           <w:rFonts w:ascii="Lato" w:eastAsia="Lato" w:hAnsi="Lato" w:cs="Lato"/>
-          <w:color w:val="000000"/>
-        </w:rPr>
-      </w:pPr>
-      <w:r>
-        <w:rPr>
-          <w:rFonts w:ascii="Lato" w:eastAsia="Lato" w:hAnsi="Lato" w:cs="Lato"/>
-          <w:color w:val="000000"/>
-        </w:rPr>
-        <w:t>Automated database reconciliation workflows with Python scripts, eliminating manual daily effort.</w:t>
+        </w:rPr>
+      </w:pPr>
+      <w:r>
+        <w:rPr>
+          <w:rFonts w:ascii="Lato" w:hAnsi="Lato"/>
+        </w:rPr>
+        <w:t>Remediated critical security issues by enabling encryption for SQS/SNS/S3 via KMS, tightening IAM policies to least privilege, and upgrading vulnerable dependencies.</w:t>
       </w:r>
     </w:p>
     <w:p>
       <w:pPr>
+        <w:pStyle w:val="ListParagraph"/>
+        <w:numPr>
+          <w:ilvl w:val="0"/>
+          <w:numId w:val="8"/>
+        </w:numPr>
         <w:tabs>
           <w:tab w:val="right" w:pos="11250"/>
         </w:tabs>
         <w:rPr>
           <w:rFonts w:ascii="Lato" w:eastAsia="Lato" w:hAnsi="Lato" w:cs="Lato"/>
-          <w:sz w:val="16"/>
-          <w:szCs w:val="16"/>
+        </w:rPr>
+      </w:pPr>
+      <w:r>
+        <w:rPr>
+          <w:rFonts w:ascii="Lato" w:hAnsi="Lato"/>
+        </w:rPr>
+        <w:t>Executed EC2 host migrations across IAD/PDX Availability Zones for 10+ applications and 100+ environments, validating cutovers with alarms and dashboards to maintain zero downtime.</w:t>
+      </w:r>
+    </w:p>
+    <w:p>
+      <w:pPr>
+        <w:pStyle w:val="ListParagraph"/>
+        <w:numPr>
+          <w:ilvl w:val="0"/>
+          <w:numId w:val="8"/>
+        </w:numPr>
+        <w:tabs>
+          <w:tab w:val="right" w:pos="11250"/>
+        </w:tabs>
+        <w:rPr>
+          <w:rFonts w:ascii="Lato" w:eastAsia="Lato" w:hAnsi="Lato" w:cs="Lato"/>
+        </w:rPr>
+      </w:pPr>
+      <w:r>
+        <w:rPr>
+          <w:rFonts w:ascii="Lato" w:hAnsi="Lato"/>
+        </w:rPr>
+        <w:t>Reduced operational support load by resolving pipeline failures, monitoring alarms, and deployment errors across production application workflows.</w:t>
+      </w:r>
+    </w:p>
+    <w:p>
+      <w:pPr>
+        <w:tabs>
+          <w:tab w:val="right" w:pos="11250"/>
+        </w:tabs>
+        <w:rPr>
+          <w:rFonts w:ascii="Lato" w:eastAsia="Lato" w:hAnsi="Lato" w:cs="Lato"/>
+          <w:sz w:val="12"/>
+          <w:szCs w:val="12"/>
+        </w:rPr>
+      </w:pPr>
+    </w:p>
+    <w:p>
+      <w:pPr>
+        <w:tabs>
+          <w:tab w:val="right" w:pos="11250"/>
+        </w:tabs>
+        <w:rPr>
+          <w:rFonts w:ascii="Lato" w:eastAsia="Lato" w:hAnsi="Lato" w:cs="Lato"/>
+        </w:rPr>
+      </w:pPr>
+      <w:r>
+        <w:rPr>
+          <w:rFonts w:ascii="Lato" w:eastAsia="Lato" w:hAnsi="Lato" w:cs="Lato"/>
+          <w:b/>
+          <w:bCs/>
+        </w:rPr>
+        <w:t>Software Developer</w:t>
+      </w:r>
+      <w:r>
+        <w:rPr>
+          <w:rFonts w:ascii="Lato" w:eastAsia="Lato" w:hAnsi="Lato" w:cs="Lato"/>
+        </w:rPr>
+        <w:t>, Radian Group Inc.</w:t>
+      </w:r>
+      <w:r>
+        <w:rPr>
+          <w:rFonts w:ascii="Lato" w:eastAsia="Lato" w:hAnsi="Lato" w:cs="Lato"/>
+        </w:rPr>
+        <w:tab/>
+        <w:t>09/2019 – 04/2022</w:t>
+      </w:r>
+    </w:p>
+    <w:p>
+      <w:pPr>
+        <w:pStyle w:val="ListParagraph"/>
+        <w:numPr>
+          <w:ilvl w:val="0"/>
+          <w:numId w:val="9"/>
+        </w:numPr>
+        <w:tabs>
+          <w:tab w:val="right" w:pos="11250"/>
+        </w:tabs>
+        <w:rPr>
+          <w:rFonts w:ascii="Lato" w:eastAsia="Lato" w:hAnsi="Lato" w:cs="Lato"/>
+        </w:rPr>
+      </w:pPr>
+      <w:r>
+        <w:rPr>
+          <w:rFonts w:ascii="Lato" w:hAnsi="Lato"/>
+        </w:rPr>
+        <w:t xml:space="preserve">Contributed to the launch and maintenance of </w:t>
+      </w:r>
+      <w:proofErr w:type="spellStart"/>
+      <w:r>
+        <w:rPr>
+          <w:rFonts w:ascii="Lato" w:hAnsi="Lato"/>
+        </w:rPr>
+        <w:t>MyRadian</w:t>
+      </w:r>
+      <w:proofErr w:type="spellEnd"/>
+      <w:r>
+        <w:rPr>
+          <w:rFonts w:ascii="Lato" w:hAnsi="Lato"/>
+        </w:rPr>
+        <w:t>, a React and Node.js application suite for valuation and asset-management services, supporting feature delivery, reviews, bug fixes, and production support.</w:t>
+      </w:r>
+    </w:p>
+    <w:p>
+      <w:pPr>
+        <w:pStyle w:val="ListParagraph"/>
+        <w:numPr>
+          <w:ilvl w:val="0"/>
+          <w:numId w:val="9"/>
+        </w:numPr>
+        <w:tabs>
+          <w:tab w:val="right" w:pos="11250"/>
+        </w:tabs>
+        <w:rPr>
+          <w:rFonts w:ascii="Lato" w:eastAsia="Lato" w:hAnsi="Lato" w:cs="Lato"/>
+        </w:rPr>
+      </w:pPr>
+      <w:r>
+        <w:rPr>
+          <w:rFonts w:ascii="Lato" w:hAnsi="Lato"/>
+        </w:rPr>
+        <w:t>Troubleshot production issues and improved performance using AWS CloudWatch, X-Ray, DynamoDB, Splunk, and SQL across modern and legacy C#/.NET and Java applications.</w:t>
+      </w:r>
+    </w:p>
+    <w:p>
+      <w:pPr>
+        <w:pStyle w:val="ListParagraph"/>
+        <w:numPr>
+          <w:ilvl w:val="0"/>
+          <w:numId w:val="9"/>
+        </w:numPr>
+        <w:tabs>
+          <w:tab w:val="right" w:pos="11250"/>
+        </w:tabs>
+        <w:rPr>
+          <w:rFonts w:ascii="Lato" w:eastAsia="Lato" w:hAnsi="Lato" w:cs="Lato"/>
+        </w:rPr>
+      </w:pPr>
+      <w:r>
+        <w:rPr>
+          <w:rFonts w:ascii="Lato" w:hAnsi="Lato"/>
+        </w:rPr>
+        <w:t>Automated database reconciliation workflows with Python scripts, eliminating recurring manual operations and improving data accuracy.</w:t>
+      </w:r>
+    </w:p>
+    <w:p>
+      <w:pPr>
+        <w:tabs>
+          <w:tab w:val="right" w:pos="11250"/>
+        </w:tabs>
+        <w:rPr>
+          <w:rFonts w:ascii="Lato" w:eastAsia="Lato" w:hAnsi="Lato" w:cs="Lato"/>
+          <w:sz w:val="12"/>
+          <w:szCs w:val="12"/>
         </w:rPr>
       </w:pPr>
     </w:p>
@@ -858,95 +631,134 @@
     </w:p>
     <w:p>
       <w:pPr>
+        <w:pStyle w:val="ListParagraph"/>
         <w:numPr>
           <w:ilvl w:val="0"/>
-          <w:numId w:val="1"/>
+          <w:numId w:val="11"/>
         </w:numPr>
-        <w:pBdr>
-          <w:top w:val="nil"/>
-          <w:left w:val="nil"/>
-          <w:bottom w:val="nil"/>
-          <w:right w:val="nil"/>
-          <w:between w:val="nil"/>
-        </w:pBdr>
-        <w:rPr>
-          <w:rFonts w:ascii="Lato" w:eastAsia="Lato" w:hAnsi="Lato" w:cs="Lato"/>
-          <w:color w:val="000000"/>
-        </w:rPr>
-      </w:pPr>
-      <w:hyperlink r:id="rId12">
-        <w:r>
-          <w:rPr>
-            <w:rFonts w:ascii="Lato" w:eastAsia="Lato" w:hAnsi="Lato" w:cs="Lato"/>
-            <w:b/>
-            <w:bCs/>
-            <w:color w:val="0000FF"/>
-            <w:u w:val="single"/>
-          </w:rPr>
-          <w:t>Sudoku</w:t>
-        </w:r>
-      </w:hyperlink>
-      <w:r>
-        <w:rPr>
-          <w:rFonts w:ascii="Lato" w:eastAsia="Lato" w:hAnsi="Lato" w:cs="Lato"/>
+        <w:rPr>
+          <w:rFonts w:ascii="Lato" w:eastAsia="Raleway" w:hAnsi="Lato" w:cs="Raleway"/>
           <w:b/>
           <w:bCs/>
+          <w:color w:val="666666"/>
+          <w:sz w:val="28"/>
+          <w:szCs w:val="28"/>
+        </w:rPr>
+      </w:pPr>
+      <w:r>
+        <w:rPr>
+          <w:rFonts w:ascii="Lato" w:hAnsi="Lato"/>
+        </w:rPr>
+        <w:fldChar w:fldCharType="begin"/>
+      </w:r>
+      <w:r>
+        <w:rPr>
+          <w:rFonts w:ascii="Lato" w:hAnsi="Lato"/>
+        </w:rPr>
+        <w:instrText>HYPERLINK "https://github.com/natezimm/sudoku" \h</w:instrText>
+      </w:r>
+      <w:r>
+        <w:rPr>
+          <w:rFonts w:ascii="Lato" w:hAnsi="Lato"/>
+        </w:rPr>
+        <w:fldChar w:fldCharType="separate"/>
+      </w:r>
+      <w:r>
+        <w:rPr>
+          <w:rFonts w:ascii="Lato" w:eastAsia="Lato" w:hAnsi="Lato" w:cs="Lato"/>
+          <w:color w:val="0000FF"/>
+          <w:u w:val="single"/>
+        </w:rPr>
+        <w:t>Sudoku</w:t>
+      </w:r>
+      <w:r>
+        <w:rPr>
+          <w:rFonts w:ascii="Lato" w:eastAsia="Lato" w:hAnsi="Lato" w:cs="Lato"/>
+          <w:color w:val="0000FF"/>
+          <w:u w:val="single"/>
+        </w:rPr>
+        <w:fldChar w:fldCharType="end"/>
+      </w:r>
+      <w:r>
+        <w:rPr>
+          <w:rFonts w:ascii="Lato" w:eastAsia="Lato" w:hAnsi="Lato" w:cs="Lato"/>
           <w:color w:val="000000"/>
         </w:rPr>
+        <w:t xml:space="preserve"> - Built a full-stack Sudoku app with a .NET Web API puzzle generator and Angular gameplay UI. Added validation, rate limiting, and CI-backed tests to keep gameplay reliable.</w:t>
+      </w:r>
+      <w:r>
+        <w:rPr>
+          <w:rFonts w:ascii="Lato" w:eastAsia="Lato" w:hAnsi="Lato" w:cs="Lato"/>
+          <w:color w:val="000000"/>
+        </w:rPr>
+        <w:t xml:space="preserve"> |</w:t>
+      </w:r>
+      <w:r>
+        <w:rPr>
+          <w:rFonts w:ascii="Lato" w:hAnsi="Lato"/>
+        </w:rPr>
         <w:t xml:space="preserve"> </w:t>
       </w:r>
       <w:r>
         <w:rPr>
-          <w:rFonts w:ascii="Lato" w:eastAsia="Lato" w:hAnsi="Lato" w:cs="Lato"/>
-          <w:color w:val="000000"/>
-        </w:rPr>
-        <w:t xml:space="preserve">( </w:t>
-      </w:r>
-      <w:hyperlink r:id="rId13">
+          <w:rFonts w:ascii="Lato" w:hAnsi="Lato"/>
+        </w:rPr>
+        <w:fldChar w:fldCharType="begin"/>
+      </w:r>
+      <w:r>
+        <w:rPr>
+          <w:rFonts w:ascii="Lato" w:hAnsi="Lato"/>
+        </w:rPr>
+        <w:instrText>HYPERLINK "https://sudoku.nathanzimmerman.com/" \h</w:instrText>
+      </w:r>
+      <w:r>
+        <w:rPr>
+          <w:rFonts w:ascii="Lato" w:hAnsi="Lato"/>
+        </w:rPr>
+        <w:fldChar w:fldCharType="separate"/>
+      </w:r>
+      <w:proofErr w:type="spellStart"/>
+      <w:r>
+        <w:rPr>
+          <w:rFonts w:ascii="Lato" w:eastAsia="Lato" w:hAnsi="Lato" w:cs="Lato"/>
+          <w:color w:val="0000FF"/>
+          <w:u w:val="single"/>
+        </w:rPr>
+        <w:t>sudoku.nathanzimmerman.com</w:t>
+      </w:r>
+      <w:r>
+        <w:rPr>
+          <w:rFonts w:ascii="Lato" w:eastAsia="Lato" w:hAnsi="Lato" w:cs="Lato"/>
+          <w:color w:val="0000FF"/>
+          <w:u w:val="single"/>
+        </w:rPr>
+        <w:fldChar w:fldCharType="end"/>
+      </w:r>
+      <w:proofErr w:type="spellEnd"/>
+    </w:p>
+    <w:p>
+      <w:pPr>
+        <w:pStyle w:val="ListParagraph"/>
+        <w:numPr>
+          <w:ilvl w:val="0"/>
+          <w:numId w:val="11"/>
+        </w:numPr>
+        <w:rPr>
+          <w:rFonts w:ascii="Lato" w:eastAsia="Raleway" w:hAnsi="Lato" w:cs="Raleway"/>
+          <w:b/>
+          <w:bCs/>
+          <w:color w:val="666666"/>
+          <w:sz w:val="28"/>
+          <w:szCs w:val="28"/>
+        </w:rPr>
+      </w:pPr>
+      <w:hyperlink r:id="rId12">
         <w:r>
           <w:rPr>
             <w:rFonts w:ascii="Lato" w:eastAsia="Lato" w:hAnsi="Lato" w:cs="Lato"/>
             <w:color w:val="0000FF"/>
             <w:u w:val="single"/>
           </w:rPr>
-          <w:t>sudoku.nathanzimmerman.com</w:t>
-        </w:r>
-      </w:hyperlink>
-      <w:r>
-        <w:rPr>
-          <w:rFonts w:ascii="Lato" w:eastAsia="Lato" w:hAnsi="Lato" w:cs="Lato"/>
-          <w:color w:val="000000"/>
-        </w:rPr>
-        <w:t xml:space="preserve"> ) - Built a full-stack Sudoku app with a .NET Web API puzzle generator and Angular gameplay UI. Added validation, rate limiting, and CI-backed tests to keep gameplay reliable.</w:t>
-      </w:r>
-    </w:p>
-    <w:p>
-      <w:pPr>
-        <w:numPr>
-          <w:ilvl w:val="0"/>
-          <w:numId w:val="1"/>
-        </w:numPr>
-        <w:pBdr>
-          <w:top w:val="nil"/>
-          <w:left w:val="nil"/>
-          <w:bottom w:val="nil"/>
-          <w:right w:val="nil"/>
-          <w:between w:val="nil"/>
-        </w:pBdr>
-        <w:rPr>
-          <w:rFonts w:ascii="Lato" w:eastAsia="Lato" w:hAnsi="Lato" w:cs="Lato"/>
-          <w:color w:val="000000"/>
-        </w:rPr>
-      </w:pPr>
-      <w:hyperlink r:id="rId14">
-        <w:r>
-          <w:rPr>
-            <w:rFonts w:ascii="Lato" w:eastAsia="Lato" w:hAnsi="Lato" w:cs="Lato"/>
-            <w:b/>
-            <w:bCs/>
-            <w:color w:val="0000FF"/>
-            <w:u w:val="single"/>
-          </w:rPr>
           <w:t>Blackjack</w:t>
         </w:r>
       </w:hyperlink>
@@ -955,9 +767,23 @@
           <w:rFonts w:ascii="Lato" w:eastAsia="Lato" w:hAnsi="Lato" w:cs="Lato"/>
           <w:color w:val="000000"/>
         </w:rPr>
-        <w:t xml:space="preserve"> ( </w:t>
-      </w:r>
-      <w:hyperlink r:id="rId15">
+        <w:t xml:space="preserve"> - Built a session-backed Blackjack game with Spring Boot + Spring Security and a React UI. Implemented rules (splits, insurance) plus validation and security hardening.</w:t>
+      </w:r>
+      <w:r>
+        <w:rPr>
+          <w:rFonts w:ascii="Lato" w:eastAsia="Lato" w:hAnsi="Lato" w:cs="Lato"/>
+          <w:color w:val="000000"/>
+        </w:rPr>
+        <w:t xml:space="preserve"> |</w:t>
+      </w:r>
+      <w:r>
+        <w:rPr>
+          <w:rFonts w:ascii="Lato" w:hAnsi="Lato"/>
+        </w:rPr>
+        <w:t xml:space="preserve"> </w:t>
+      </w:r>
+      <w:hyperlink r:id="rId13">
+        <w:proofErr w:type="spellStart"/>
         <w:r>
           <w:rPr>
             <w:rFonts w:ascii="Lato" w:eastAsia="Lato" w:hAnsi="Lato" w:cs="Lato"/>
@@ -967,20 +793,161 @@
           <w:t>blackjack.nathanzimmerman.com</w:t>
         </w:r>
       </w:hyperlink>
-      <w:r>
-        <w:rPr>
-          <w:rFonts w:ascii="Lato" w:eastAsia="Lato" w:hAnsi="Lato" w:cs="Lato"/>
-          <w:color w:val="000000"/>
-        </w:rPr>
-        <w:t xml:space="preserve"> ) - Built a session-backed Blackjack game with Spring Boot + Spring Security and a React UI. Implemented rules (splits, insurance) plus validation and security hardening.</w:t>
-      </w:r>
+      <w:proofErr w:type="spellEnd"/>
     </w:p>
     <w:p>
       <w:pPr>
+        <w:pStyle w:val="ListParagraph"/>
         <w:numPr>
           <w:ilvl w:val="0"/>
-          <w:numId w:val="1"/>
+          <w:numId w:val="11"/>
         </w:numPr>
+        <w:rPr>
+          <w:rFonts w:ascii="Lato" w:eastAsia="Raleway" w:hAnsi="Lato" w:cs="Raleway"/>
+          <w:b/>
+          <w:bCs/>
+          <w:color w:val="666666"/>
+          <w:sz w:val="28"/>
+          <w:szCs w:val="28"/>
+        </w:rPr>
+      </w:pPr>
+      <w:hyperlink r:id="rId14">
+        <w:proofErr w:type="spellStart"/>
+        <w:r>
+          <w:rPr>
+            <w:rFonts w:ascii="Lato" w:eastAsia="Lato" w:hAnsi="Lato" w:cs="Lato"/>
+            <w:color w:val="0000FF"/>
+            <w:u w:val="single"/>
+          </w:rPr>
+          <w:t>Nerdle</w:t>
+        </w:r>
+        <w:proofErr w:type="spellEnd"/>
+      </w:hyperlink>
+      <w:r>
+        <w:rPr>
+          <w:rFonts w:ascii="Lato" w:eastAsia="Lato" w:hAnsi="Lato" w:cs="Lato"/>
+          <w:color w:val="000000"/>
+        </w:rPr>
+        <w:t xml:space="preserve"> </w:t>
+      </w:r>
+      <w:r>
+        <w:rPr>
+          <w:rFonts w:ascii="Lato" w:eastAsia="Lato" w:hAnsi="Lato" w:cs="Lato"/>
+          <w:color w:val="000000"/>
+        </w:rPr>
+        <w:t xml:space="preserve">- </w:t>
+      </w:r>
+      <w:r>
+        <w:rPr>
+          <w:rFonts w:ascii="Lato" w:eastAsia="Lato" w:hAnsi="Lato" w:cs="Lato"/>
+          <w:color w:val="000000"/>
+        </w:rPr>
+        <w:t>Built a Wordle-style game with a Node/Express backend that validates guesses server-side. Added rate limiting, theming, and stats tracking.</w:t>
+      </w:r>
+      <w:r>
+        <w:rPr>
+          <w:rFonts w:ascii="Lato" w:eastAsia="Lato" w:hAnsi="Lato" w:cs="Lato"/>
+          <w:color w:val="000000"/>
+        </w:rPr>
+        <w:t xml:space="preserve"> |</w:t>
+      </w:r>
+      <w:r>
+        <w:rPr>
+          <w:rFonts w:ascii="Lato" w:hAnsi="Lato"/>
+        </w:rPr>
+        <w:t xml:space="preserve"> </w:t>
+      </w:r>
+      <w:hyperlink r:id="rId15">
+        <w:r>
+          <w:rPr>
+            <w:rFonts w:ascii="Lato" w:eastAsia="Lato" w:hAnsi="Lato" w:cs="Lato"/>
+            <w:color w:val="0000FF"/>
+            <w:u w:val="single"/>
+          </w:rPr>
+          <w:t>nerdle.nathanzimmerman.com</w:t>
+        </w:r>
+      </w:hyperlink>
+      <w:r>
+        <w:rPr>
+          <w:rFonts w:ascii="Lato" w:eastAsia="Lato" w:hAnsi="Lato" w:cs="Lato"/>
+          <w:color w:val="000000"/>
+        </w:rPr>
+        <w:t xml:space="preserve">  </w:t>
+      </w:r>
+    </w:p>
+    <w:p>
+      <w:pPr>
+        <w:pStyle w:val="ListParagraph"/>
+        <w:numPr>
+          <w:ilvl w:val="0"/>
+          <w:numId w:val="11"/>
+        </w:numPr>
+        <w:rPr>
+          <w:rFonts w:ascii="Lato" w:eastAsia="Raleway" w:hAnsi="Lato" w:cs="Raleway"/>
+          <w:b/>
+          <w:bCs/>
+          <w:color w:val="666666"/>
+          <w:sz w:val="28"/>
+          <w:szCs w:val="28"/>
+        </w:rPr>
+      </w:pPr>
+      <w:hyperlink r:id="rId16">
+        <w:r>
+          <w:rPr>
+            <w:rFonts w:ascii="Lato" w:eastAsia="Lato" w:hAnsi="Lato" w:cs="Lato"/>
+            <w:color w:val="0000FF"/>
+            <w:u w:val="single"/>
+          </w:rPr>
+          <w:t>Brick Breaker Resume</w:t>
+        </w:r>
+      </w:hyperlink>
+      <w:r>
+        <w:rPr>
+          <w:rFonts w:ascii="Lato" w:eastAsia="Lato" w:hAnsi="Lato" w:cs="Lato"/>
+          <w:color w:val="000000"/>
+        </w:rPr>
+        <w:t xml:space="preserve"> </w:t>
+      </w:r>
+      <w:r>
+        <w:rPr>
+          <w:rFonts w:ascii="Lato" w:eastAsia="Lato" w:hAnsi="Lato" w:cs="Lato"/>
+          <w:color w:val="000000"/>
+        </w:rPr>
+        <w:t>-</w:t>
+      </w:r>
+      <w:r>
+        <w:rPr>
+          <w:rFonts w:ascii="Lato" w:eastAsia="Lato" w:hAnsi="Lato" w:cs="Lato"/>
+          <w:color w:val="000000"/>
+        </w:rPr>
+        <w:t xml:space="preserve"> Built a Phaser game that parses a live .docx resume to generate levels from text. Implemented mapping logic, responsive scaling, and score persistence.</w:t>
+      </w:r>
+      <w:r>
+        <w:rPr>
+          <w:rFonts w:ascii="Lato" w:eastAsia="Lato" w:hAnsi="Lato" w:cs="Lato"/>
+          <w:color w:val="000000"/>
+        </w:rPr>
+        <w:t xml:space="preserve"> |</w:t>
+      </w:r>
+      <w:r>
+        <w:rPr>
+          <w:rFonts w:ascii="Lato" w:hAnsi="Lato"/>
+        </w:rPr>
+        <w:t xml:space="preserve"> </w:t>
+      </w:r>
+      <w:hyperlink r:id="rId17">
+        <w:r>
+          <w:rPr>
+            <w:rFonts w:ascii="Lato" w:eastAsia="Lato" w:hAnsi="Lato" w:cs="Lato"/>
+            <w:color w:val="0000FF"/>
+            <w:u w:val="single"/>
+          </w:rPr>
+          <w:t>resume.nathanzimmerman.com</w:t>
+        </w:r>
+      </w:hyperlink>
+    </w:p>
+    <w:p>
+      <w:pPr>
         <w:pBdr>
           <w:top w:val="nil"/>
           <w:left w:val="nil"/>
@@ -990,67 +957,36 @@
         </w:pBdr>
         <w:rPr>
           <w:rFonts w:ascii="Lato" w:eastAsia="Lato" w:hAnsi="Lato" w:cs="Lato"/>
-          <w:color w:val="000000"/>
-        </w:rPr>
-      </w:pPr>
-      <w:hyperlink r:id="rId16">
-        <w:proofErr w:type="spellStart"/>
-        <w:r>
-          <w:rPr>
-            <w:rFonts w:ascii="Lato" w:eastAsia="Lato" w:hAnsi="Lato" w:cs="Lato"/>
-            <w:b/>
-            <w:bCs/>
-            <w:color w:val="0000FF"/>
-            <w:u w:val="single"/>
-          </w:rPr>
-          <w:t>Nerdle</w:t>
-        </w:r>
-        <w:proofErr w:type="spellEnd"/>
-      </w:hyperlink>
-      <w:r>
-        <w:rPr>
-          <w:rFonts w:ascii="Lato" w:eastAsia="Lato" w:hAnsi="Lato" w:cs="Lato"/>
+          <w:sz w:val="12"/>
+          <w:szCs w:val="12"/>
+        </w:rPr>
+      </w:pPr>
+    </w:p>
+    <w:p>
+      <w:pPr>
+        <w:rPr>
+          <w:rFonts w:ascii="Raleway" w:eastAsia="Raleway" w:hAnsi="Raleway" w:cs="Raleway"/>
           <w:b/>
           <w:bCs/>
-          <w:color w:val="000000"/>
-        </w:rPr>
-        <w:t xml:space="preserve"> ( </w:t>
-      </w:r>
-      <w:hyperlink r:id="rId17">
-        <w:r>
-          <w:rPr>
-            <w:rFonts w:ascii="Lato" w:eastAsia="Lato" w:hAnsi="Lato" w:cs="Lato"/>
-            <w:b/>
-            <w:bCs/>
-            <w:color w:val="0000FF"/>
-            <w:u w:val="single"/>
-          </w:rPr>
-          <w:t>nerdle.nathanzimmerman.com</w:t>
-        </w:r>
-      </w:hyperlink>
-      <w:r>
-        <w:rPr>
-          <w:rFonts w:ascii="Lato" w:eastAsia="Lato" w:hAnsi="Lato" w:cs="Lato"/>
+          <w:color w:val="666666"/>
+          <w:sz w:val="28"/>
+          <w:szCs w:val="28"/>
+        </w:rPr>
+      </w:pPr>
+      <w:r>
+        <w:rPr>
+          <w:rFonts w:ascii="Raleway" w:eastAsia="Raleway" w:hAnsi="Raleway" w:cs="Raleway"/>
           <w:b/>
           <w:bCs/>
-          <w:color w:val="000000"/>
-        </w:rPr>
-        <w:t xml:space="preserve">  ) </w:t>
-      </w:r>
-      <w:r>
-        <w:rPr>
-          <w:rFonts w:ascii="Lato" w:eastAsia="Lato" w:hAnsi="Lato" w:cs="Lato"/>
-          <w:color w:val="000000"/>
-        </w:rPr>
-        <w:t>– Built a Wordle-style game with a Node/Express backend that validates guesses server-side. Added rate limiting, theming, and stats tracking.</w:t>
+          <w:color w:val="666666"/>
+          <w:sz w:val="28"/>
+          <w:szCs w:val="28"/>
+        </w:rPr>
+        <w:t>SKILLS</w:t>
       </w:r>
     </w:p>
     <w:p>
       <w:pPr>
-        <w:numPr>
-          <w:ilvl w:val="0"/>
-          <w:numId w:val="1"/>
-        </w:numPr>
         <w:pBdr>
           <w:top w:val="nil"/>
           <w:left w:val="nil"/>
@@ -1060,59 +996,72 @@
         </w:pBdr>
         <w:rPr>
           <w:rFonts w:ascii="Lato" w:eastAsia="Lato" w:hAnsi="Lato" w:cs="Lato"/>
+          <w:color w:val="000000"/>
+        </w:rPr>
+      </w:pPr>
+      <w:bookmarkStart w:id="0" w:name="_heading=h.gjdgxs" w:colFirst="0" w:colLast="0"/>
+      <w:bookmarkEnd w:id="0"/>
+      <w:r>
+        <w:t>C#,</w:t>
+      </w:r>
+      <w:r>
+        <w:t xml:space="preserve"> </w:t>
+      </w:r>
+      <w:r>
+        <w:t>.NET, Azure, AWS, REST APIs, Microservices,</w:t>
+      </w:r>
+      <w:r>
+        <w:t xml:space="preserve"> </w:t>
+      </w:r>
+      <w:r>
+        <w:t>MongoDB</w:t>
+      </w:r>
+      <w:r>
+        <w:t>,</w:t>
+      </w:r>
+      <w:r>
+        <w:t xml:space="preserve"> </w:t>
+      </w:r>
+      <w:r>
+        <w:t xml:space="preserve">JavaScript, Node.js, Angular, React, Java, </w:t>
+      </w:r>
+      <w:r>
+        <w:t xml:space="preserve">CI/CD, </w:t>
+      </w:r>
+      <w:r>
+        <w:t>Git</w:t>
+      </w:r>
+    </w:p>
+    <w:p>
+      <w:pPr>
+        <w:rPr>
+          <w:rFonts w:ascii="Lato" w:eastAsia="Lato" w:hAnsi="Lato" w:cs="Lato"/>
+          <w:sz w:val="12"/>
+          <w:szCs w:val="12"/>
+        </w:rPr>
+      </w:pPr>
+    </w:p>
+    <w:p>
+      <w:pPr>
+        <w:rPr>
+          <w:rFonts w:ascii="Raleway" w:eastAsia="Raleway" w:hAnsi="Raleway" w:cs="Raleway"/>
           <w:b/>
           <w:bCs/>
           <w:color w:val="666666"/>
-        </w:rPr>
-      </w:pPr>
-      <w:hyperlink r:id="rId18">
-        <w:r>
-          <w:rPr>
-            <w:rFonts w:ascii="Lato" w:eastAsia="Lato" w:hAnsi="Lato" w:cs="Lato"/>
-            <w:b/>
-            <w:bCs/>
-            <w:color w:val="0000FF"/>
-            <w:u w:val="single"/>
-          </w:rPr>
-          <w:t>Brick Breaker Resume</w:t>
-        </w:r>
-      </w:hyperlink>
-      <w:r>
-        <w:rPr>
-          <w:rFonts w:ascii="Lato" w:eastAsia="Lato" w:hAnsi="Lato" w:cs="Lato"/>
+          <w:sz w:val="28"/>
+          <w:szCs w:val="28"/>
+        </w:rPr>
+      </w:pPr>
+      <w:r>
+        <w:rPr>
+          <w:rFonts w:ascii="Raleway" w:eastAsia="Raleway" w:hAnsi="Raleway" w:cs="Raleway"/>
           <w:b/>
           <w:bCs/>
-          <w:color w:val="000000"/>
-        </w:rPr>
-        <w:t xml:space="preserve"> ( </w:t>
-      </w:r>
-      <w:hyperlink r:id="rId19">
-        <w:r>
-          <w:rPr>
-            <w:rFonts w:ascii="Lato" w:eastAsia="Lato" w:hAnsi="Lato" w:cs="Lato"/>
-            <w:b/>
-            <w:bCs/>
-            <w:color w:val="0000FF"/>
-            <w:u w:val="single"/>
-          </w:rPr>
-          <w:t>resume.nathanzimmerman.com</w:t>
-        </w:r>
-      </w:hyperlink>
-      <w:r>
-        <w:rPr>
-          <w:rFonts w:ascii="Lato" w:eastAsia="Lato" w:hAnsi="Lato" w:cs="Lato"/>
-          <w:b/>
-          <w:bCs/>
-          <w:color w:val="000000"/>
-        </w:rPr>
-        <w:t xml:space="preserve"> )</w:t>
-      </w:r>
-      <w:r>
-        <w:rPr>
-          <w:rFonts w:ascii="Lato" w:eastAsia="Lato" w:hAnsi="Lato" w:cs="Lato"/>
-          <w:color w:val="000000"/>
-        </w:rPr>
-        <w:t>– Built a Phaser game that parses a live .docx resume to generate levels from text. Implemented mapping logic, responsive scaling, and score persistence.</w:t>
+          <w:color w:val="666666"/>
+          <w:sz w:val="28"/>
+          <w:szCs w:val="28"/>
+        </w:rPr>
+        <w:t>EDUCATION</w:t>
       </w:r>
     </w:p>
     <w:p>
@@ -1126,40 +1075,25 @@
         </w:pBdr>
         <w:rPr>
           <w:rFonts w:ascii="Lato" w:eastAsia="Lato" w:hAnsi="Lato" w:cs="Lato"/>
-          <w:sz w:val="16"/>
-          <w:szCs w:val="16"/>
-        </w:rPr>
-      </w:pPr>
+        </w:rPr>
+      </w:pPr>
+      <w:r>
+        <w:rPr>
+          <w:rFonts w:ascii="Lato" w:eastAsia="Lato" w:hAnsi="Lato" w:cs="Lato"/>
+          <w:b/>
+          <w:bCs/>
+        </w:rPr>
+        <w:t>AS, Computer Science,</w:t>
+      </w:r>
+      <w:r>
+        <w:rPr>
+          <w:rFonts w:ascii="Lato" w:eastAsia="Lato" w:hAnsi="Lato" w:cs="Lato"/>
+        </w:rPr>
+        <w:t xml:space="preserve"> Delaware County Community College, 2018</w:t>
+      </w:r>
     </w:p>
     <w:p>
       <w:pPr>
-        <w:rPr>
-          <w:rFonts w:ascii="Raleway" w:eastAsia="Raleway" w:hAnsi="Raleway" w:cs="Raleway"/>
-          <w:b/>
-          <w:bCs/>
-          <w:color w:val="666666"/>
-          <w:sz w:val="28"/>
-          <w:szCs w:val="28"/>
-        </w:rPr>
-      </w:pPr>
-      <w:r>
-        <w:rPr>
-          <w:rFonts w:ascii="Raleway" w:eastAsia="Raleway" w:hAnsi="Raleway" w:cs="Raleway"/>
-          <w:b/>
-          <w:bCs/>
-          <w:color w:val="666666"/>
-          <w:sz w:val="28"/>
-          <w:szCs w:val="28"/>
-        </w:rPr>
-        <w:t>SKILLS</w:t>
-      </w:r>
-    </w:p>
-    <w:p>
-      <w:pPr>
-        <w:numPr>
-          <w:ilvl w:val="0"/>
-          <w:numId w:val="4"/>
-        </w:numPr>
         <w:pBdr>
           <w:top w:val="nil"/>
           <w:left w:val="nil"/>
@@ -1169,111 +1103,13 @@
         </w:pBdr>
         <w:rPr>
           <w:rFonts w:ascii="Lato" w:eastAsia="Lato" w:hAnsi="Lato" w:cs="Lato"/>
-          <w:color w:val="000000"/>
-        </w:rPr>
-      </w:pPr>
-      <w:bookmarkStart w:id="0" w:name="_heading=h.gjdgxs" w:colFirst="0" w:colLast="0"/>
-      <w:bookmarkEnd w:id="0"/>
-      <w:r>
-        <w:rPr>
-          <w:rFonts w:ascii="Lato" w:eastAsia="Lato" w:hAnsi="Lato" w:cs="Lato"/>
-          <w:color w:val="000000"/>
-        </w:rPr>
-        <w:t>HTML, CSS, JavaScript, Angular, React, Java, Node.js, C#, .NET, MongoDB, Azure, AWS, REST API, Git</w:t>
-      </w:r>
-    </w:p>
-    <w:p>
-      <w:pPr>
-        <w:rPr>
-          <w:rFonts w:ascii="Lato" w:eastAsia="Lato" w:hAnsi="Lato" w:cs="Lato"/>
-        </w:rPr>
-      </w:pPr>
-    </w:p>
-    <w:p>
-      <w:pPr>
-        <w:rPr>
-          <w:rFonts w:ascii="Raleway" w:eastAsia="Raleway" w:hAnsi="Raleway" w:cs="Raleway"/>
+        </w:rPr>
+      </w:pPr>
+      <w:r>
+        <w:rPr>
+          <w:rFonts w:ascii="Lato" w:eastAsia="Lato" w:hAnsi="Lato" w:cs="Lato"/>
           <w:b/>
           <w:bCs/>
-          <w:color w:val="666666"/>
-          <w:sz w:val="28"/>
-          <w:szCs w:val="28"/>
-        </w:rPr>
-      </w:pPr>
-      <w:r>
-        <w:rPr>
-          <w:rFonts w:ascii="Raleway" w:eastAsia="Raleway" w:hAnsi="Raleway" w:cs="Raleway"/>
-          <w:b/>
-          <w:bCs/>
-          <w:color w:val="666666"/>
-          <w:sz w:val="28"/>
-          <w:szCs w:val="28"/>
-        </w:rPr>
-        <w:t>EDUCATION</w:t>
-      </w:r>
-    </w:p>
-    <w:p>
-      <w:pPr>
-        <w:pBdr>
-          <w:top w:val="nil"/>
-          <w:left w:val="nil"/>
-          <w:bottom w:val="nil"/>
-          <w:right w:val="nil"/>
-          <w:between w:val="nil"/>
-        </w:pBdr>
-        <w:rPr>
-          <w:rFonts w:ascii="Lato" w:eastAsia="Lato" w:hAnsi="Lato" w:cs="Lato"/>
-        </w:rPr>
-      </w:pPr>
-      <w:r>
-        <w:rPr>
-          <w:rFonts w:ascii="Lato" w:eastAsia="Lato" w:hAnsi="Lato" w:cs="Lato"/>
-          <w:b/>
-          <w:bCs/>
-        </w:rPr>
-        <w:t>AS, Computer Science,</w:t>
-      </w:r>
-      <w:r>
-        <w:rPr>
-          <w:rFonts w:ascii="Lato" w:eastAsia="Lato" w:hAnsi="Lato" w:cs="Lato"/>
-        </w:rPr>
-        <w:t xml:space="preserve"> Delaware County Community College, 2018</w:t>
-      </w:r>
-    </w:p>
-    <w:p>
-      <w:pPr>
-        <w:pBdr>
-          <w:top w:val="nil"/>
-          <w:left w:val="nil"/>
-          <w:bottom w:val="nil"/>
-          <w:right w:val="nil"/>
-          <w:between w:val="nil"/>
-        </w:pBdr>
-        <w:rPr>
-          <w:rFonts w:ascii="Lato" w:eastAsia="Lato" w:hAnsi="Lato" w:cs="Lato"/>
-          <w:sz w:val="16"/>
-          <w:szCs w:val="16"/>
-        </w:rPr>
-      </w:pPr>
-    </w:p>
-    <w:p>
-      <w:pPr>
-        <w:pBdr>
-          <w:top w:val="nil"/>
-          <w:left w:val="nil"/>
-          <w:bottom w:val="nil"/>
-          <w:right w:val="nil"/>
-          <w:between w:val="nil"/>
-        </w:pBdr>
-        <w:rPr>
-          <w:rFonts w:ascii="Lato" w:eastAsia="Lato" w:hAnsi="Lato" w:cs="Lato"/>
-        </w:rPr>
-      </w:pPr>
-      <w:r>
-        <w:rPr>
-          <w:rFonts w:ascii="Lato" w:eastAsia="Lato" w:hAnsi="Lato" w:cs="Lato"/>
-          <w:b/>
-          <w:bCs/>
         </w:rPr>
         <w:t>BA, Psychology,</w:t>
       </w:r>
@@ -1285,7 +1121,7 @@
       </w:r>
     </w:p>
     <w:sectPr>
-      <w:headerReference w:type="default" r:id="rId20"/>
+      <w:headerReference w:type="default" r:id="rId18"/>
       <w:pgSz w:w="12240" w:h="15840"/>
       <w:pgMar w:top="431" w:right="431" w:bottom="431" w:left="431" w:header="0" w:footer="720" w:gutter="0"/>
       <w:pgNumType w:start="1"/>
@@ -1354,9 +1190,500 @@
 <file path=word/numbering.xml><?xml version="1.0" encoding="utf-8"?>
 <w:numbering xmlns:wpc="http://schemas.microsoft.com/office/word/2010/wordprocessingCanvas" xmlns:cx="http://schemas.microsoft.com/office/drawing/2014/chartex" xmlns:cx1="http://schemas.microsoft.com/office/drawing/2015/9/8/chartex" xmlns:cx2="http://schemas.microsoft.com/office/drawing/2015/10/21/chartex" xmlns:cx3="http://schemas.microsoft.com/office/drawing/2016/5/9/chartex" xmlns:cx4="http://schemas.microsoft.com/office/drawing/2016/5/10/chartex" xmlns:cx5="http://schemas.microsoft.com/office/drawing/2016/5/11/chartex" xmlns:cx6="http://schemas.microsoft.com/office/drawing/2016/5/12/chartex" xmlns:cx7="http://schemas.microsoft.com/office/drawing/2016/5/13/chartex" xmlns:cx8="http://schemas.microsoft.com/office/drawing/2016/5/14/chartex" xmlns:mc="http://schemas.openxmlformats.org/markup-compatibility/2006" xmlns:aink="http://schemas.microsoft.com/office/drawing/2016/ink" xmlns:am3d="http://schemas.microsoft.com/office/drawing/2017/model3d" xmlns:o="urn:schemas-microsoft-com:office:office" xmlns:oel="http://schemas.microsoft.com/office/2019/extlst" xmlns:r="http://schemas.openxmlformats.org/officeDocument/2006/relationships" xmlns:m="http://schemas.openxmlformats.org/officeDocument/2006/math" xmlns:v="urn:schemas-microsoft-com:vml" xmlns:wp14="http://schemas.microsoft.com/office/word/2010/wordprocessingDrawing" xmlns:wp="http://schemas.openxmlformats.org/drawingml/2006/wordprocessingDrawing" xmlns:w10="urn:schemas-microsoft-com:office:word" xmlns:w="http://schemas.openxmlformats.org/wordprocessingml/2006/main" xmlns:w14="http://schemas.microsoft.com/office/word/2010/wordml" xmlns:w15="http://schemas.microsoft.com/office/word/2012/wordml" xmlns:w16cex="http://schemas.microsoft.com/office/word/2018/wordml/cex" xmlns:w16cid="http://schemas.microsoft.com/office/word/2016/wordml/cid" xmlns:w16="http://schemas.microsoft.com/office/word/2018/wordml" xmlns:w16sdtdh="http://schemas.microsoft.com/office/word/2020/wordml/sdtdatahash" xmlns:w16se="http://schemas.microsoft.com/office/word/2015/wordml/symex" xmlns:wpg="http://schemas.microsoft.com/office/word/2010/wordprocessingGroup" xmlns:wpi="http://schemas.microsoft.com/office/word/2010/wordprocessingInk" xmlns:wne="http://schemas.microsoft.com/office/word/2006/wordml" xmlns:wps="http://schemas.microsoft.com/office/word/2010/wordprocessingShape" mc:Ignorable="w14 w15 w16se w16cid w16 w16cex w16sdtdh wp14">
   <w:abstractNum w:abstractNumId="0" w15:restartNumberingAfterBreak="0">
+    <w:nsid w:val="042A6318"/>
+    <w:multiLevelType w:val="hybridMultilevel"/>
+    <w:tmpl w:val="CBB0A6DA"/>
+    <w:lvl w:ilvl="0" w:tplc="04090001">
+      <w:start w:val="1"/>
+      <w:numFmt w:val="bullet"/>
+      <w:lvlText w:val=""/>
+      <w:lvlJc w:val="left"/>
+      <w:pPr>
+        <w:ind w:left="720" w:hanging="360"/>
+      </w:pPr>
+      <w:rPr>
+        <w:rFonts w:ascii="Symbol" w:hAnsi="Symbol" w:hint="default"/>
+      </w:rPr>
+    </w:lvl>
+    <w:lvl w:ilvl="1" w:tplc="04090003" w:tentative="1">
+      <w:start w:val="1"/>
+      <w:numFmt w:val="bullet"/>
+      <w:lvlText w:val="o"/>
+      <w:lvlJc w:val="left"/>
+      <w:pPr>
+        <w:ind w:left="1440" w:hanging="360"/>
+      </w:pPr>
+      <w:rPr>
+        <w:rFonts w:ascii="Courier New" w:hAnsi="Courier New" w:cs="Courier New" w:hint="default"/>
+      </w:rPr>
+    </w:lvl>
+    <w:lvl w:ilvl="2" w:tplc="04090005" w:tentative="1">
+      <w:start w:val="1"/>
+      <w:numFmt w:val="bullet"/>
+      <w:lvlText w:val=""/>
+      <w:lvlJc w:val="left"/>
+      <w:pPr>
+        <w:ind w:left="2160" w:hanging="360"/>
+      </w:pPr>
+      <w:rPr>
+        <w:rFonts w:ascii="Wingdings" w:hAnsi="Wingdings" w:hint="default"/>
+      </w:rPr>
+    </w:lvl>
+    <w:lvl w:ilvl="3" w:tplc="04090001" w:tentative="1">
+      <w:start w:val="1"/>
+      <w:numFmt w:val="bullet"/>
+      <w:lvlText w:val=""/>
+      <w:lvlJc w:val="left"/>
+      <w:pPr>
+        <w:ind w:left="2880" w:hanging="360"/>
+      </w:pPr>
+      <w:rPr>
+        <w:rFonts w:ascii="Symbol" w:hAnsi="Symbol" w:hint="default"/>
+      </w:rPr>
+    </w:lvl>
+    <w:lvl w:ilvl="4" w:tplc="04090003" w:tentative="1">
+      <w:start w:val="1"/>
+      <w:numFmt w:val="bullet"/>
+      <w:lvlText w:val="o"/>
+      <w:lvlJc w:val="left"/>
+      <w:pPr>
+        <w:ind w:left="3600" w:hanging="360"/>
+      </w:pPr>
+      <w:rPr>
+        <w:rFonts w:ascii="Courier New" w:hAnsi="Courier New" w:cs="Courier New" w:hint="default"/>
+      </w:rPr>
+    </w:lvl>
+    <w:lvl w:ilvl="5" w:tplc="04090005" w:tentative="1">
+      <w:start w:val="1"/>
+      <w:numFmt w:val="bullet"/>
+      <w:lvlText w:val=""/>
+      <w:lvlJc w:val="left"/>
+      <w:pPr>
+        <w:ind w:left="4320" w:hanging="360"/>
+      </w:pPr>
+      <w:rPr>
+        <w:rFonts w:ascii="Wingdings" w:hAnsi="Wingdings" w:hint="default"/>
+      </w:rPr>
+    </w:lvl>
+    <w:lvl w:ilvl="6" w:tplc="04090001" w:tentative="1">
+      <w:start w:val="1"/>
+      <w:numFmt w:val="bullet"/>
+      <w:lvlText w:val=""/>
+      <w:lvlJc w:val="left"/>
+      <w:pPr>
+        <w:ind w:left="5040" w:hanging="360"/>
+      </w:pPr>
+      <w:rPr>
+        <w:rFonts w:ascii="Symbol" w:hAnsi="Symbol" w:hint="default"/>
+      </w:rPr>
+    </w:lvl>
+    <w:lvl w:ilvl="7" w:tplc="04090003" w:tentative="1">
+      <w:start w:val="1"/>
+      <w:numFmt w:val="bullet"/>
+      <w:lvlText w:val="o"/>
+      <w:lvlJc w:val="left"/>
+      <w:pPr>
+        <w:ind w:left="5760" w:hanging="360"/>
+      </w:pPr>
+      <w:rPr>
+        <w:rFonts w:ascii="Courier New" w:hAnsi="Courier New" w:cs="Courier New" w:hint="default"/>
+      </w:rPr>
+    </w:lvl>
+    <w:lvl w:ilvl="8" w:tplc="04090005" w:tentative="1">
+      <w:start w:val="1"/>
+      <w:numFmt w:val="bullet"/>
+      <w:lvlText w:val=""/>
+      <w:lvlJc w:val="left"/>
+      <w:pPr>
+        <w:ind w:left="6480" w:hanging="360"/>
+      </w:pPr>
+      <w:rPr>
+        <w:rFonts w:ascii="Wingdings" w:hAnsi="Wingdings" w:hint="default"/>
+      </w:rPr>
+    </w:lvl>
+  </w:abstractNum>
+  <w:abstractNum w:abstractNumId="1" w15:restartNumberingAfterBreak="0">
+    <w:nsid w:val="04654B8A"/>
+    <w:multiLevelType w:val="hybridMultilevel"/>
+    <w:tmpl w:val="74BE16C6"/>
+    <w:lvl w:ilvl="0" w:tplc="04090001">
+      <w:start w:val="1"/>
+      <w:numFmt w:val="bullet"/>
+      <w:lvlText w:val=""/>
+      <w:lvlJc w:val="left"/>
+      <w:pPr>
+        <w:ind w:left="360" w:hanging="360"/>
+      </w:pPr>
+      <w:rPr>
+        <w:rFonts w:ascii="Symbol" w:hAnsi="Symbol" w:hint="default"/>
+      </w:rPr>
+    </w:lvl>
+    <w:lvl w:ilvl="1" w:tplc="04090003" w:tentative="1">
+      <w:start w:val="1"/>
+      <w:numFmt w:val="bullet"/>
+      <w:lvlText w:val="o"/>
+      <w:lvlJc w:val="left"/>
+      <w:pPr>
+        <w:ind w:left="1080" w:hanging="360"/>
+      </w:pPr>
+      <w:rPr>
+        <w:rFonts w:ascii="Courier New" w:hAnsi="Courier New" w:cs="Courier New" w:hint="default"/>
+      </w:rPr>
+    </w:lvl>
+    <w:lvl w:ilvl="2" w:tplc="04090005" w:tentative="1">
+      <w:start w:val="1"/>
+      <w:numFmt w:val="bullet"/>
+      <w:lvlText w:val=""/>
+      <w:lvlJc w:val="left"/>
+      <w:pPr>
+        <w:ind w:left="1800" w:hanging="360"/>
+      </w:pPr>
+      <w:rPr>
+        <w:rFonts w:ascii="Wingdings" w:hAnsi="Wingdings" w:hint="default"/>
+      </w:rPr>
+    </w:lvl>
+    <w:lvl w:ilvl="3" w:tplc="04090001" w:tentative="1">
+      <w:start w:val="1"/>
+      <w:numFmt w:val="bullet"/>
+      <w:lvlText w:val=""/>
+      <w:lvlJc w:val="left"/>
+      <w:pPr>
+        <w:ind w:left="2520" w:hanging="360"/>
+      </w:pPr>
+      <w:rPr>
+        <w:rFonts w:ascii="Symbol" w:hAnsi="Symbol" w:hint="default"/>
+      </w:rPr>
+    </w:lvl>
+    <w:lvl w:ilvl="4" w:tplc="04090003" w:tentative="1">
+      <w:start w:val="1"/>
+      <w:numFmt w:val="bullet"/>
+      <w:lvlText w:val="o"/>
+      <w:lvlJc w:val="left"/>
+      <w:pPr>
+        <w:ind w:left="3240" w:hanging="360"/>
+      </w:pPr>
+      <w:rPr>
+        <w:rFonts w:ascii="Courier New" w:hAnsi="Courier New" w:cs="Courier New" w:hint="default"/>
+      </w:rPr>
+    </w:lvl>
+    <w:lvl w:ilvl="5" w:tplc="04090005" w:tentative="1">
+      <w:start w:val="1"/>
+      <w:numFmt w:val="bullet"/>
+      <w:lvlText w:val=""/>
+      <w:lvlJc w:val="left"/>
+      <w:pPr>
+        <w:ind w:left="3960" w:hanging="360"/>
+      </w:pPr>
+      <w:rPr>
+        <w:rFonts w:ascii="Wingdings" w:hAnsi="Wingdings" w:hint="default"/>
+      </w:rPr>
+    </w:lvl>
+    <w:lvl w:ilvl="6" w:tplc="04090001" w:tentative="1">
+      <w:start w:val="1"/>
+      <w:numFmt w:val="bullet"/>
+      <w:lvlText w:val=""/>
+      <w:lvlJc w:val="left"/>
+      <w:pPr>
+        <w:ind w:left="4680" w:hanging="360"/>
+      </w:pPr>
+      <w:rPr>
+        <w:rFonts w:ascii="Symbol" w:hAnsi="Symbol" w:hint="default"/>
+      </w:rPr>
+    </w:lvl>
+    <w:lvl w:ilvl="7" w:tplc="04090003" w:tentative="1">
+      <w:start w:val="1"/>
+      <w:numFmt w:val="bullet"/>
+      <w:lvlText w:val="o"/>
+      <w:lvlJc w:val="left"/>
+      <w:pPr>
+        <w:ind w:left="5400" w:hanging="360"/>
+      </w:pPr>
+      <w:rPr>
+        <w:rFonts w:ascii="Courier New" w:hAnsi="Courier New" w:cs="Courier New" w:hint="default"/>
+      </w:rPr>
+    </w:lvl>
+    <w:lvl w:ilvl="8" w:tplc="04090005" w:tentative="1">
+      <w:start w:val="1"/>
+      <w:numFmt w:val="bullet"/>
+      <w:lvlText w:val=""/>
+      <w:lvlJc w:val="left"/>
+      <w:pPr>
+        <w:ind w:left="6120" w:hanging="360"/>
+      </w:pPr>
+      <w:rPr>
+        <w:rFonts w:ascii="Wingdings" w:hAnsi="Wingdings" w:hint="default"/>
+      </w:rPr>
+    </w:lvl>
+  </w:abstractNum>
+  <w:abstractNum w:abstractNumId="2" w15:restartNumberingAfterBreak="0">
+    <w:nsid w:val="183429B0"/>
+    <w:multiLevelType w:val="multilevel"/>
+    <w:tmpl w:val="093CB41C"/>
+    <w:lvl w:ilvl="0">
+      <w:start w:val="1"/>
+      <w:numFmt w:val="bullet"/>
+      <w:lvlText w:val=""/>
+      <w:lvlJc w:val="left"/>
+      <w:pPr>
+        <w:tabs>
+          <w:tab w:val="num" w:pos="720"/>
+        </w:tabs>
+        <w:ind w:left="720" w:hanging="360"/>
+      </w:pPr>
+      <w:rPr>
+        <w:rFonts w:ascii="Symbol" w:hAnsi="Symbol" w:hint="default"/>
+        <w:sz w:val="20"/>
+      </w:rPr>
+    </w:lvl>
+    <w:lvl w:ilvl="1" w:tentative="1">
+      <w:start w:val="1"/>
+      <w:numFmt w:val="bullet"/>
+      <w:lvlText w:val="o"/>
+      <w:lvlJc w:val="left"/>
+      <w:pPr>
+        <w:tabs>
+          <w:tab w:val="num" w:pos="1440"/>
+        </w:tabs>
+        <w:ind w:left="1440" w:hanging="360"/>
+      </w:pPr>
+      <w:rPr>
+        <w:rFonts w:ascii="Courier New" w:hAnsi="Courier New" w:hint="default"/>
+        <w:sz w:val="20"/>
+      </w:rPr>
+    </w:lvl>
+    <w:lvl w:ilvl="2" w:tentative="1">
+      <w:start w:val="1"/>
+      <w:numFmt w:val="bullet"/>
+      <w:lvlText w:val=""/>
+      <w:lvlJc w:val="left"/>
+      <w:pPr>
+        <w:tabs>
+          <w:tab w:val="num" w:pos="2160"/>
+        </w:tabs>
+        <w:ind w:left="2160" w:hanging="360"/>
+      </w:pPr>
+      <w:rPr>
+        <w:rFonts w:ascii="Wingdings" w:hAnsi="Wingdings" w:hint="default"/>
+        <w:sz w:val="20"/>
+      </w:rPr>
+    </w:lvl>
+    <w:lvl w:ilvl="3" w:tentative="1">
+      <w:start w:val="1"/>
+      <w:numFmt w:val="bullet"/>
+      <w:lvlText w:val=""/>
+      <w:lvlJc w:val="left"/>
+      <w:pPr>
+        <w:tabs>
+          <w:tab w:val="num" w:pos="2880"/>
+        </w:tabs>
+        <w:ind w:left="2880" w:hanging="360"/>
+      </w:pPr>
+      <w:rPr>
+        <w:rFonts w:ascii="Wingdings" w:hAnsi="Wingdings" w:hint="default"/>
+        <w:sz w:val="20"/>
+      </w:rPr>
+    </w:lvl>
+    <w:lvl w:ilvl="4" w:tentative="1">
+      <w:start w:val="1"/>
+      <w:numFmt w:val="bullet"/>
+      <w:lvlText w:val=""/>
+      <w:lvlJc w:val="left"/>
+      <w:pPr>
+        <w:tabs>
+          <w:tab w:val="num" w:pos="3600"/>
+        </w:tabs>
+        <w:ind w:left="3600" w:hanging="360"/>
+      </w:pPr>
+      <w:rPr>
+        <w:rFonts w:ascii="Wingdings" w:hAnsi="Wingdings" w:hint="default"/>
+        <w:sz w:val="20"/>
+      </w:rPr>
+    </w:lvl>
+    <w:lvl w:ilvl="5" w:tentative="1">
+      <w:start w:val="1"/>
+      <w:numFmt w:val="bullet"/>
+      <w:lvlText w:val=""/>
+      <w:lvlJc w:val="left"/>
+      <w:pPr>
+        <w:tabs>
+          <w:tab w:val="num" w:pos="4320"/>
+        </w:tabs>
+        <w:ind w:left="4320" w:hanging="360"/>
+      </w:pPr>
+      <w:rPr>
+        <w:rFonts w:ascii="Wingdings" w:hAnsi="Wingdings" w:hint="default"/>
+        <w:sz w:val="20"/>
+      </w:rPr>
+    </w:lvl>
+    <w:lvl w:ilvl="6" w:tentative="1">
+      <w:start w:val="1"/>
+      <w:numFmt w:val="bullet"/>
+      <w:lvlText w:val=""/>
+      <w:lvlJc w:val="left"/>
+      <w:pPr>
+        <w:tabs>
+          <w:tab w:val="num" w:pos="5040"/>
+        </w:tabs>
+        <w:ind w:left="5040" w:hanging="360"/>
+      </w:pPr>
+      <w:rPr>
+        <w:rFonts w:ascii="Wingdings" w:hAnsi="Wingdings" w:hint="default"/>
+        <w:sz w:val="20"/>
+      </w:rPr>
+    </w:lvl>
+    <w:lvl w:ilvl="7" w:tentative="1">
+      <w:start w:val="1"/>
+      <w:numFmt w:val="bullet"/>
+      <w:lvlText w:val=""/>
+      <w:lvlJc w:val="left"/>
+      <w:pPr>
+        <w:tabs>
+          <w:tab w:val="num" w:pos="5760"/>
+        </w:tabs>
+        <w:ind w:left="5760" w:hanging="360"/>
+      </w:pPr>
+      <w:rPr>
+        <w:rFonts w:ascii="Wingdings" w:hAnsi="Wingdings" w:hint="default"/>
+        <w:sz w:val="20"/>
+      </w:rPr>
+    </w:lvl>
+    <w:lvl w:ilvl="8" w:tentative="1">
+      <w:start w:val="1"/>
+      <w:numFmt w:val="bullet"/>
+      <w:lvlText w:val=""/>
+      <w:lvlJc w:val="left"/>
+      <w:pPr>
+        <w:tabs>
+          <w:tab w:val="num" w:pos="6480"/>
+        </w:tabs>
+        <w:ind w:left="6480" w:hanging="360"/>
+      </w:pPr>
+      <w:rPr>
+        <w:rFonts w:ascii="Wingdings" w:hAnsi="Wingdings" w:hint="default"/>
+        <w:sz w:val="20"/>
+      </w:rPr>
+    </w:lvl>
+  </w:abstractNum>
+  <w:abstractNum w:abstractNumId="3" w15:restartNumberingAfterBreak="0">
+    <w:nsid w:val="217F2F3B"/>
+    <w:multiLevelType w:val="hybridMultilevel"/>
+    <w:tmpl w:val="DAC8C274"/>
+    <w:lvl w:ilvl="0" w:tplc="74FC6FC4">
+      <w:start w:val="1"/>
+      <w:numFmt w:val="bullet"/>
+      <w:lvlText w:val=""/>
+      <w:lvlJc w:val="left"/>
+      <w:pPr>
+        <w:ind w:left="360" w:hanging="360"/>
+      </w:pPr>
+      <w:rPr>
+        <w:rFonts w:ascii="Symbol" w:hAnsi="Symbol" w:hint="default"/>
+        <w:color w:val="000000" w:themeColor="text1"/>
+        <w:sz w:val="22"/>
+        <w:szCs w:val="22"/>
+      </w:rPr>
+    </w:lvl>
+    <w:lvl w:ilvl="1" w:tplc="04090003" w:tentative="1">
+      <w:start w:val="1"/>
+      <w:numFmt w:val="bullet"/>
+      <w:lvlText w:val="o"/>
+      <w:lvlJc w:val="left"/>
+      <w:pPr>
+        <w:ind w:left="1080" w:hanging="360"/>
+      </w:pPr>
+      <w:rPr>
+        <w:rFonts w:ascii="Courier New" w:hAnsi="Courier New" w:cs="Courier New" w:hint="default"/>
+      </w:rPr>
+    </w:lvl>
+    <w:lvl w:ilvl="2" w:tplc="04090005" w:tentative="1">
+      <w:start w:val="1"/>
+      <w:numFmt w:val="bullet"/>
+      <w:lvlText w:val=""/>
+      <w:lvlJc w:val="left"/>
+      <w:pPr>
+        <w:ind w:left="1800" w:hanging="360"/>
+      </w:pPr>
+      <w:rPr>
+        <w:rFonts w:ascii="Wingdings" w:hAnsi="Wingdings" w:hint="default"/>
+      </w:rPr>
+    </w:lvl>
+    <w:lvl w:ilvl="3" w:tplc="04090001" w:tentative="1">
+      <w:start w:val="1"/>
+      <w:numFmt w:val="bullet"/>
+      <w:lvlText w:val=""/>
+      <w:lvlJc w:val="left"/>
+      <w:pPr>
+        <w:ind w:left="2520" w:hanging="360"/>
+      </w:pPr>
+      <w:rPr>
+        <w:rFonts w:ascii="Symbol" w:hAnsi="Symbol" w:hint="default"/>
+      </w:rPr>
+    </w:lvl>
+    <w:lvl w:ilvl="4" w:tplc="04090003" w:tentative="1">
+      <w:start w:val="1"/>
+      <w:numFmt w:val="bullet"/>
+      <w:lvlText w:val="o"/>
+      <w:lvlJc w:val="left"/>
+      <w:pPr>
+        <w:ind w:left="3240" w:hanging="360"/>
+      </w:pPr>
+      <w:rPr>
+        <w:rFonts w:ascii="Courier New" w:hAnsi="Courier New" w:cs="Courier New" w:hint="default"/>
+      </w:rPr>
+    </w:lvl>
+    <w:lvl w:ilvl="5" w:tplc="04090005" w:tentative="1">
+      <w:start w:val="1"/>
+      <w:numFmt w:val="bullet"/>
+      <w:lvlText w:val=""/>
+      <w:lvlJc w:val="left"/>
+      <w:pPr>
+        <w:ind w:left="3960" w:hanging="360"/>
+      </w:pPr>
+      <w:rPr>
+        <w:rFonts w:ascii="Wingdings" w:hAnsi="Wingdings" w:hint="default"/>
+      </w:rPr>
+    </w:lvl>
+    <w:lvl w:ilvl="6" w:tplc="04090001" w:tentative="1">
+      <w:start w:val="1"/>
+      <w:numFmt w:val="bullet"/>
+      <w:lvlText w:val=""/>
+      <w:lvlJc w:val="left"/>
+      <w:pPr>
+        <w:ind w:left="4680" w:hanging="360"/>
+      </w:pPr>
+      <w:rPr>
+        <w:rFonts w:ascii="Symbol" w:hAnsi="Symbol" w:hint="default"/>
+      </w:rPr>
+    </w:lvl>
+    <w:lvl w:ilvl="7" w:tplc="04090003" w:tentative="1">
+      <w:start w:val="1"/>
+      <w:numFmt w:val="bullet"/>
+      <w:lvlText w:val="o"/>
+      <w:lvlJc w:val="left"/>
+      <w:pPr>
+        <w:ind w:left="5400" w:hanging="360"/>
+      </w:pPr>
+      <w:rPr>
+        <w:rFonts w:ascii="Courier New" w:hAnsi="Courier New" w:cs="Courier New" w:hint="default"/>
+      </w:rPr>
+    </w:lvl>
+    <w:lvl w:ilvl="8" w:tplc="04090005" w:tentative="1">
+      <w:start w:val="1"/>
+      <w:numFmt w:val="bullet"/>
+      <w:lvlText w:val=""/>
+      <w:lvlJc w:val="left"/>
+      <w:pPr>
+        <w:ind w:left="6120" w:hanging="360"/>
+      </w:pPr>
+      <w:rPr>
+        <w:rFonts w:ascii="Wingdings" w:hAnsi="Wingdings" w:hint="default"/>
+      </w:rPr>
+    </w:lvl>
+  </w:abstractNum>
+  <w:abstractNum w:abstractNumId="4" w15:restartNumberingAfterBreak="0">
     <w:nsid w:val="29BA10F6"/>
     <w:multiLevelType w:val="multilevel"/>
-    <w:tmpl w:val="9E0CC034"/>
+    <w:tmpl w:val="28326440"/>
     <w:lvl w:ilvl="0">
       <w:start w:val="1"/>
       <w:numFmt w:val="bullet"/>
@@ -1366,7 +1693,7 @@
         <w:ind w:left="720" w:hanging="360"/>
       </w:pPr>
       <w:rPr>
-        <w:rFonts w:ascii="Noto Sans Symbols" w:eastAsia="Noto Sans Symbols" w:hAnsi="Noto Sans Symbols" w:cs="Noto Sans Symbols"/>
+        <w:rFonts w:ascii="Symbol" w:eastAsia="Noto Sans Symbols" w:hAnsi="Symbol" w:cs="Noto Sans Symbols" w:hint="default"/>
         <w:sz w:val="22"/>
         <w:szCs w:val="22"/>
         <w:u w:val="none"/>
@@ -1469,7 +1796,7 @@
       </w:rPr>
     </w:lvl>
   </w:abstractNum>
-  <w:abstractNum w:abstractNumId="1" w15:restartNumberingAfterBreak="0">
+  <w:abstractNum w:abstractNumId="5" w15:restartNumberingAfterBreak="0">
     <w:nsid w:val="2A3917A7"/>
     <w:multiLevelType w:val="multilevel"/>
     <w:tmpl w:val="3990CB7E"/>
@@ -1584,7 +1911,123 @@
       </w:rPr>
     </w:lvl>
   </w:abstractNum>
-  <w:abstractNum w:abstractNumId="2" w15:restartNumberingAfterBreak="0">
+  <w:abstractNum w:abstractNumId="6" w15:restartNumberingAfterBreak="0">
+    <w:nsid w:val="2D7E7771"/>
+    <w:multiLevelType w:val="hybridMultilevel"/>
+    <w:tmpl w:val="FCA86202"/>
+    <w:lvl w:ilvl="0" w:tplc="74FC6FC4">
+      <w:start w:val="1"/>
+      <w:numFmt w:val="bullet"/>
+      <w:lvlText w:val=""/>
+      <w:lvlJc w:val="left"/>
+      <w:pPr>
+        <w:ind w:left="360" w:hanging="360"/>
+      </w:pPr>
+      <w:rPr>
+        <w:rFonts w:ascii="Symbol" w:hAnsi="Symbol" w:hint="default"/>
+        <w:color w:val="000000" w:themeColor="text1"/>
+        <w:sz w:val="22"/>
+        <w:szCs w:val="22"/>
+      </w:rPr>
+    </w:lvl>
+    <w:lvl w:ilvl="1" w:tplc="04090003" w:tentative="1">
+      <w:start w:val="1"/>
+      <w:numFmt w:val="bullet"/>
+      <w:lvlText w:val="o"/>
+      <w:lvlJc w:val="left"/>
+      <w:pPr>
+        <w:ind w:left="1080" w:hanging="360"/>
+      </w:pPr>
+      <w:rPr>
+        <w:rFonts w:ascii="Courier New" w:hAnsi="Courier New" w:cs="Courier New" w:hint="default"/>
+      </w:rPr>
+    </w:lvl>
+    <w:lvl w:ilvl="2" w:tplc="04090005" w:tentative="1">
+      <w:start w:val="1"/>
+      <w:numFmt w:val="bullet"/>
+      <w:lvlText w:val=""/>
+      <w:lvlJc w:val="left"/>
+      <w:pPr>
+        <w:ind w:left="1800" w:hanging="360"/>
+      </w:pPr>
+      <w:rPr>
+        <w:rFonts w:ascii="Wingdings" w:hAnsi="Wingdings" w:hint="default"/>
+      </w:rPr>
+    </w:lvl>
+    <w:lvl w:ilvl="3" w:tplc="04090001" w:tentative="1">
+      <w:start w:val="1"/>
+      <w:numFmt w:val="bullet"/>
+      <w:lvlText w:val=""/>
+      <w:lvlJc w:val="left"/>
+      <w:pPr>
+        <w:ind w:left="2520" w:hanging="360"/>
+      </w:pPr>
+      <w:rPr>
+        <w:rFonts w:ascii="Symbol" w:hAnsi="Symbol" w:hint="default"/>
+      </w:rPr>
+    </w:lvl>
+    <w:lvl w:ilvl="4" w:tplc="04090003" w:tentative="1">
+      <w:start w:val="1"/>
+      <w:numFmt w:val="bullet"/>
+      <w:lvlText w:val="o"/>
+      <w:lvlJc w:val="left"/>
+      <w:pPr>
+        <w:ind w:left="3240" w:hanging="360"/>
+      </w:pPr>
+      <w:rPr>
+        <w:rFonts w:ascii="Courier New" w:hAnsi="Courier New" w:cs="Courier New" w:hint="default"/>
+      </w:rPr>
+    </w:lvl>
+    <w:lvl w:ilvl="5" w:tplc="04090005" w:tentative="1">
+      <w:start w:val="1"/>
+      <w:numFmt w:val="bullet"/>
+      <w:lvlText w:val=""/>
+      <w:lvlJc w:val="left"/>
+      <w:pPr>
+        <w:ind w:left="3960" w:hanging="360"/>
+      </w:pPr>
+      <w:rPr>
+        <w:rFonts w:ascii="Wingdings" w:hAnsi="Wingdings" w:hint="default"/>
+      </w:rPr>
+    </w:lvl>
+    <w:lvl w:ilvl="6" w:tplc="04090001" w:tentative="1">
+      <w:start w:val="1"/>
+      <w:numFmt w:val="bullet"/>
+      <w:lvlText w:val=""/>
+      <w:lvlJc w:val="left"/>
+      <w:pPr>
+        <w:ind w:left="4680" w:hanging="360"/>
+      </w:pPr>
+      <w:rPr>
+        <w:rFonts w:ascii="Symbol" w:hAnsi="Symbol" w:hint="default"/>
+      </w:rPr>
+    </w:lvl>
+    <w:lvl w:ilvl="7" w:tplc="04090003" w:tentative="1">
+      <w:start w:val="1"/>
+      <w:numFmt w:val="bullet"/>
+      <w:lvlText w:val="o"/>
+      <w:lvlJc w:val="left"/>
+      <w:pPr>
+        <w:ind w:left="5400" w:hanging="360"/>
+      </w:pPr>
+      <w:rPr>
+        <w:rFonts w:ascii="Courier New" w:hAnsi="Courier New" w:cs="Courier New" w:hint="default"/>
+      </w:rPr>
+    </w:lvl>
+    <w:lvl w:ilvl="8" w:tplc="04090005" w:tentative="1">
+      <w:start w:val="1"/>
+      <w:numFmt w:val="bullet"/>
+      <w:lvlText w:val=""/>
+      <w:lvlJc w:val="left"/>
+      <w:pPr>
+        <w:ind w:left="6120" w:hanging="360"/>
+      </w:pPr>
+      <w:rPr>
+        <w:rFonts w:ascii="Wingdings" w:hAnsi="Wingdings" w:hint="default"/>
+      </w:rPr>
+    </w:lvl>
+  </w:abstractNum>
+  <w:abstractNum w:abstractNumId="7" w15:restartNumberingAfterBreak="0">
     <w:nsid w:val="346D7F2D"/>
     <w:multiLevelType w:val="multilevel"/>
     <w:tmpl w:val="8D6629FE"/>
@@ -1594,7 +2037,7 @@
       <w:lvlText w:val="●"/>
       <w:lvlJc w:val="left"/>
       <w:pPr>
-        <w:ind w:left="720" w:hanging="360"/>
+        <w:ind w:left="360" w:hanging="360"/>
       </w:pPr>
       <w:rPr>
         <w:u w:val="none"/>
@@ -1606,7 +2049,7 @@
       <w:lvlText w:val="○"/>
       <w:lvlJc w:val="left"/>
       <w:pPr>
-        <w:ind w:left="1440" w:hanging="360"/>
+        <w:ind w:left="1080" w:hanging="360"/>
       </w:pPr>
       <w:rPr>
         <w:u w:val="none"/>
@@ -1618,7 +2061,7 @@
       <w:lvlText w:val="■"/>
       <w:lvlJc w:val="left"/>
       <w:pPr>
-        <w:ind w:left="2160" w:hanging="360"/>
+        <w:ind w:left="1800" w:hanging="360"/>
       </w:pPr>
       <w:rPr>
         <w:u w:val="none"/>
@@ -1630,7 +2073,7 @@
       <w:lvlText w:val="●"/>
       <w:lvlJc w:val="left"/>
       <w:pPr>
-        <w:ind w:left="2880" w:hanging="360"/>
+        <w:ind w:left="2520" w:hanging="360"/>
       </w:pPr>
       <w:rPr>
         <w:u w:val="none"/>
@@ -1642,7 +2085,7 @@
       <w:lvlText w:val="○"/>
       <w:lvlJc w:val="left"/>
       <w:pPr>
-        <w:ind w:left="3600" w:hanging="360"/>
+        <w:ind w:left="3240" w:hanging="360"/>
       </w:pPr>
       <w:rPr>
         <w:u w:val="none"/>
@@ -1654,7 +2097,7 @@
       <w:lvlText w:val="■"/>
       <w:lvlJc w:val="left"/>
       <w:pPr>
-        <w:ind w:left="4320" w:hanging="360"/>
+        <w:ind w:left="3960" w:hanging="360"/>
       </w:pPr>
       <w:rPr>
         <w:u w:val="none"/>
@@ -1666,7 +2109,7 @@
       <w:lvlText w:val="●"/>
       <w:lvlJc w:val="left"/>
       <w:pPr>
-        <w:ind w:left="5040" w:hanging="360"/>
+        <w:ind w:left="4680" w:hanging="360"/>
       </w:pPr>
       <w:rPr>
         <w:u w:val="none"/>
@@ -1678,7 +2121,7 @@
       <w:lvlText w:val="○"/>
       <w:lvlJc w:val="left"/>
       <w:pPr>
-        <w:ind w:left="5760" w:hanging="360"/>
+        <w:ind w:left="5400" w:hanging="360"/>
       </w:pPr>
       <w:rPr>
         <w:u w:val="none"/>
@@ -1690,14 +2133,14 @@
       <w:lvlText w:val="■"/>
       <w:lvlJc w:val="left"/>
       <w:pPr>
-        <w:ind w:left="6480" w:hanging="360"/>
+        <w:ind w:left="6120" w:hanging="360"/>
       </w:pPr>
       <w:rPr>
         <w:u w:val="none"/>
       </w:rPr>
     </w:lvl>
   </w:abstractNum>
-  <w:abstractNum w:abstractNumId="3" w15:restartNumberingAfterBreak="0">
+  <w:abstractNum w:abstractNumId="8" w15:restartNumberingAfterBreak="0">
     <w:nsid w:val="56276416"/>
     <w:multiLevelType w:val="multilevel"/>
     <w:tmpl w:val="BEFEB100"/>
@@ -1828,10 +2271,10 @@
       </w:rPr>
     </w:lvl>
   </w:abstractNum>
-  <w:abstractNum w:abstractNumId="4" w15:restartNumberingAfterBreak="0">
+  <w:abstractNum w:abstractNumId="9" w15:restartNumberingAfterBreak="0">
     <w:nsid w:val="634E03BF"/>
     <w:multiLevelType w:val="multilevel"/>
-    <w:tmpl w:val="D40A1234"/>
+    <w:tmpl w:val="A7ACEEBA"/>
     <w:lvl w:ilvl="0">
       <w:start w:val="1"/>
       <w:numFmt w:val="bullet"/>
@@ -1841,9 +2284,9 @@
         <w:ind w:left="720" w:hanging="360"/>
       </w:pPr>
       <w:rPr>
-        <w:rFonts w:ascii="Noto Sans Symbols" w:eastAsia="Noto Sans Symbols" w:hAnsi="Noto Sans Symbols" w:cs="Noto Sans Symbols"/>
-        <w:sz w:val="24"/>
-        <w:szCs w:val="24"/>
+        <w:rFonts w:ascii="Symbol" w:eastAsia="Noto Sans Symbols" w:hAnsi="Symbol" w:cs="Noto Sans Symbols" w:hint="default"/>
+        <w:sz w:val="22"/>
+        <w:szCs w:val="22"/>
       </w:rPr>
     </w:lvl>
     <w:lvl w:ilvl="1">
@@ -1959,20 +2402,386 @@
       </w:rPr>
     </w:lvl>
   </w:abstractNum>
+  <w:abstractNum w:abstractNumId="10" w15:restartNumberingAfterBreak="0">
+    <w:nsid w:val="699B3D89"/>
+    <w:multiLevelType w:val="hybridMultilevel"/>
+    <w:tmpl w:val="F82AE612"/>
+    <w:lvl w:ilvl="0" w:tplc="74FC6FC4">
+      <w:start w:val="1"/>
+      <w:numFmt w:val="bullet"/>
+      <w:lvlText w:val=""/>
+      <w:lvlJc w:val="left"/>
+      <w:pPr>
+        <w:ind w:left="360" w:hanging="360"/>
+      </w:pPr>
+      <w:rPr>
+        <w:rFonts w:ascii="Symbol" w:hAnsi="Symbol" w:hint="default"/>
+        <w:color w:val="000000" w:themeColor="text1"/>
+        <w:sz w:val="22"/>
+        <w:szCs w:val="22"/>
+      </w:rPr>
+    </w:lvl>
+    <w:lvl w:ilvl="1" w:tplc="04090003" w:tentative="1">
+      <w:start w:val="1"/>
+      <w:numFmt w:val="bullet"/>
+      <w:lvlText w:val="o"/>
+      <w:lvlJc w:val="left"/>
+      <w:pPr>
+        <w:ind w:left="1080" w:hanging="360"/>
+      </w:pPr>
+      <w:rPr>
+        <w:rFonts w:ascii="Courier New" w:hAnsi="Courier New" w:cs="Courier New" w:hint="default"/>
+      </w:rPr>
+    </w:lvl>
+    <w:lvl w:ilvl="2" w:tplc="04090005" w:tentative="1">
+      <w:start w:val="1"/>
+      <w:numFmt w:val="bullet"/>
+      <w:lvlText w:val=""/>
+      <w:lvlJc w:val="left"/>
+      <w:pPr>
+        <w:ind w:left="1800" w:hanging="360"/>
+      </w:pPr>
+      <w:rPr>
+        <w:rFonts w:ascii="Wingdings" w:hAnsi="Wingdings" w:hint="default"/>
+      </w:rPr>
+    </w:lvl>
+    <w:lvl w:ilvl="3" w:tplc="04090001" w:tentative="1">
+      <w:start w:val="1"/>
+      <w:numFmt w:val="bullet"/>
+      <w:lvlText w:val=""/>
+      <w:lvlJc w:val="left"/>
+      <w:pPr>
+        <w:ind w:left="2520" w:hanging="360"/>
+      </w:pPr>
+      <w:rPr>
+        <w:rFonts w:ascii="Symbol" w:hAnsi="Symbol" w:hint="default"/>
+      </w:rPr>
+    </w:lvl>
+    <w:lvl w:ilvl="4" w:tplc="04090003" w:tentative="1">
+      <w:start w:val="1"/>
+      <w:numFmt w:val="bullet"/>
+      <w:lvlText w:val="o"/>
+      <w:lvlJc w:val="left"/>
+      <w:pPr>
+        <w:ind w:left="3240" w:hanging="360"/>
+      </w:pPr>
+      <w:rPr>
+        <w:rFonts w:ascii="Courier New" w:hAnsi="Courier New" w:cs="Courier New" w:hint="default"/>
+      </w:rPr>
+    </w:lvl>
+    <w:lvl w:ilvl="5" w:tplc="04090005" w:tentative="1">
+      <w:start w:val="1"/>
+      <w:numFmt w:val="bullet"/>
+      <w:lvlText w:val=""/>
+      <w:lvlJc w:val="left"/>
+      <w:pPr>
+        <w:ind w:left="3960" w:hanging="360"/>
+      </w:pPr>
+      <w:rPr>
+        <w:rFonts w:ascii="Wingdings" w:hAnsi="Wingdings" w:hint="default"/>
+      </w:rPr>
+    </w:lvl>
+    <w:lvl w:ilvl="6" w:tplc="04090001" w:tentative="1">
+      <w:start w:val="1"/>
+      <w:numFmt w:val="bullet"/>
+      <w:lvlText w:val=""/>
+      <w:lvlJc w:val="left"/>
+      <w:pPr>
+        <w:ind w:left="4680" w:hanging="360"/>
+      </w:pPr>
+      <w:rPr>
+        <w:rFonts w:ascii="Symbol" w:hAnsi="Symbol" w:hint="default"/>
+      </w:rPr>
+    </w:lvl>
+    <w:lvl w:ilvl="7" w:tplc="04090003" w:tentative="1">
+      <w:start w:val="1"/>
+      <w:numFmt w:val="bullet"/>
+      <w:lvlText w:val="o"/>
+      <w:lvlJc w:val="left"/>
+      <w:pPr>
+        <w:ind w:left="5400" w:hanging="360"/>
+      </w:pPr>
+      <w:rPr>
+        <w:rFonts w:ascii="Courier New" w:hAnsi="Courier New" w:cs="Courier New" w:hint="default"/>
+      </w:rPr>
+    </w:lvl>
+    <w:lvl w:ilvl="8" w:tplc="04090005" w:tentative="1">
+      <w:start w:val="1"/>
+      <w:numFmt w:val="bullet"/>
+      <w:lvlText w:val=""/>
+      <w:lvlJc w:val="left"/>
+      <w:pPr>
+        <w:ind w:left="6120" w:hanging="360"/>
+      </w:pPr>
+      <w:rPr>
+        <w:rFonts w:ascii="Wingdings" w:hAnsi="Wingdings" w:hint="default"/>
+      </w:rPr>
+    </w:lvl>
+  </w:abstractNum>
+  <w:abstractNum w:abstractNumId="11" w15:restartNumberingAfterBreak="0">
+    <w:nsid w:val="7A1379DE"/>
+    <w:multiLevelType w:val="hybridMultilevel"/>
+    <w:tmpl w:val="0A7A4CA0"/>
+    <w:lvl w:ilvl="0" w:tplc="04090001">
+      <w:start w:val="1"/>
+      <w:numFmt w:val="bullet"/>
+      <w:lvlText w:val=""/>
+      <w:lvlJc w:val="left"/>
+      <w:pPr>
+        <w:ind w:left="360" w:hanging="360"/>
+      </w:pPr>
+      <w:rPr>
+        <w:rFonts w:ascii="Symbol" w:hAnsi="Symbol" w:hint="default"/>
+      </w:rPr>
+    </w:lvl>
+    <w:lvl w:ilvl="1" w:tplc="04090003" w:tentative="1">
+      <w:start w:val="1"/>
+      <w:numFmt w:val="bullet"/>
+      <w:lvlText w:val="o"/>
+      <w:lvlJc w:val="left"/>
+      <w:pPr>
+        <w:ind w:left="1080" w:hanging="360"/>
+      </w:pPr>
+      <w:rPr>
+        <w:rFonts w:ascii="Courier New" w:hAnsi="Courier New" w:cs="Courier New" w:hint="default"/>
+      </w:rPr>
+    </w:lvl>
+    <w:lvl w:ilvl="2" w:tplc="04090005" w:tentative="1">
+      <w:start w:val="1"/>
+      <w:numFmt w:val="bullet"/>
+      <w:lvlText w:val=""/>
+      <w:lvlJc w:val="left"/>
+      <w:pPr>
+        <w:ind w:left="1800" w:hanging="360"/>
+      </w:pPr>
+      <w:rPr>
+        <w:rFonts w:ascii="Wingdings" w:hAnsi="Wingdings" w:hint="default"/>
+      </w:rPr>
+    </w:lvl>
+    <w:lvl w:ilvl="3" w:tplc="04090001" w:tentative="1">
+      <w:start w:val="1"/>
+      <w:numFmt w:val="bullet"/>
+      <w:lvlText w:val=""/>
+      <w:lvlJc w:val="left"/>
+      <w:pPr>
+        <w:ind w:left="2520" w:hanging="360"/>
+      </w:pPr>
+      <w:rPr>
+        <w:rFonts w:ascii="Symbol" w:hAnsi="Symbol" w:hint="default"/>
+      </w:rPr>
+    </w:lvl>
+    <w:lvl w:ilvl="4" w:tplc="04090003" w:tentative="1">
+      <w:start w:val="1"/>
+      <w:numFmt w:val="bullet"/>
+      <w:lvlText w:val="o"/>
+      <w:lvlJc w:val="left"/>
+      <w:pPr>
+        <w:ind w:left="3240" w:hanging="360"/>
+      </w:pPr>
+      <w:rPr>
+        <w:rFonts w:ascii="Courier New" w:hAnsi="Courier New" w:cs="Courier New" w:hint="default"/>
+      </w:rPr>
+    </w:lvl>
+    <w:lvl w:ilvl="5" w:tplc="04090005" w:tentative="1">
+      <w:start w:val="1"/>
+      <w:numFmt w:val="bullet"/>
+      <w:lvlText w:val=""/>
+      <w:lvlJc w:val="left"/>
+      <w:pPr>
+        <w:ind w:left="3960" w:hanging="360"/>
+      </w:pPr>
+      <w:rPr>
+        <w:rFonts w:ascii="Wingdings" w:hAnsi="Wingdings" w:hint="default"/>
+      </w:rPr>
+    </w:lvl>
+    <w:lvl w:ilvl="6" w:tplc="04090001" w:tentative="1">
+      <w:start w:val="1"/>
+      <w:numFmt w:val="bullet"/>
+      <w:lvlText w:val=""/>
+      <w:lvlJc w:val="left"/>
+      <w:pPr>
+        <w:ind w:left="4680" w:hanging="360"/>
+      </w:pPr>
+      <w:rPr>
+        <w:rFonts w:ascii="Symbol" w:hAnsi="Symbol" w:hint="default"/>
+      </w:rPr>
+    </w:lvl>
+    <w:lvl w:ilvl="7" w:tplc="04090003" w:tentative="1">
+      <w:start w:val="1"/>
+      <w:numFmt w:val="bullet"/>
+      <w:lvlText w:val="o"/>
+      <w:lvlJc w:val="left"/>
+      <w:pPr>
+        <w:ind w:left="5400" w:hanging="360"/>
+      </w:pPr>
+      <w:rPr>
+        <w:rFonts w:ascii="Courier New" w:hAnsi="Courier New" w:cs="Courier New" w:hint="default"/>
+      </w:rPr>
+    </w:lvl>
+    <w:lvl w:ilvl="8" w:tplc="04090005" w:tentative="1">
+      <w:start w:val="1"/>
+      <w:numFmt w:val="bullet"/>
+      <w:lvlText w:val=""/>
+      <w:lvlJc w:val="left"/>
+      <w:pPr>
+        <w:ind w:left="6120" w:hanging="360"/>
+      </w:pPr>
+      <w:rPr>
+        <w:rFonts w:ascii="Wingdings" w:hAnsi="Wingdings" w:hint="default"/>
+      </w:rPr>
+    </w:lvl>
+  </w:abstractNum>
+  <w:abstractNum w:abstractNumId="12" w15:restartNumberingAfterBreak="0">
+    <w:nsid w:val="7BEC6001"/>
+    <w:multiLevelType w:val="hybridMultilevel"/>
+    <w:tmpl w:val="98206D1A"/>
+    <w:lvl w:ilvl="0" w:tplc="04090001">
+      <w:start w:val="1"/>
+      <w:numFmt w:val="bullet"/>
+      <w:lvlText w:val=""/>
+      <w:lvlJc w:val="left"/>
+      <w:pPr>
+        <w:ind w:left="720" w:hanging="360"/>
+      </w:pPr>
+      <w:rPr>
+        <w:rFonts w:ascii="Symbol" w:hAnsi="Symbol" w:hint="default"/>
+      </w:rPr>
+    </w:lvl>
+    <w:lvl w:ilvl="1" w:tplc="04090003" w:tentative="1">
+      <w:start w:val="1"/>
+      <w:numFmt w:val="bullet"/>
+      <w:lvlText w:val="o"/>
+      <w:lvlJc w:val="left"/>
+      <w:pPr>
+        <w:ind w:left="1440" w:hanging="360"/>
+      </w:pPr>
+      <w:rPr>
+        <w:rFonts w:ascii="Courier New" w:hAnsi="Courier New" w:cs="Courier New" w:hint="default"/>
+      </w:rPr>
+    </w:lvl>
+    <w:lvl w:ilvl="2" w:tplc="04090005" w:tentative="1">
+      <w:start w:val="1"/>
+      <w:numFmt w:val="bullet"/>
+      <w:lvlText w:val=""/>
+      <w:lvlJc w:val="left"/>
+      <w:pPr>
+        <w:ind w:left="2160" w:hanging="360"/>
+      </w:pPr>
+      <w:rPr>
+        <w:rFonts w:ascii="Wingdings" w:hAnsi="Wingdings" w:hint="default"/>
+      </w:rPr>
+    </w:lvl>
+    <w:lvl w:ilvl="3" w:tplc="04090001" w:tentative="1">
+      <w:start w:val="1"/>
+      <w:numFmt w:val="bullet"/>
+      <w:lvlText w:val=""/>
+      <w:lvlJc w:val="left"/>
+      <w:pPr>
+        <w:ind w:left="2880" w:hanging="360"/>
+      </w:pPr>
+      <w:rPr>
+        <w:rFonts w:ascii="Symbol" w:hAnsi="Symbol" w:hint="default"/>
+      </w:rPr>
+    </w:lvl>
+    <w:lvl w:ilvl="4" w:tplc="04090003" w:tentative="1">
+      <w:start w:val="1"/>
+      <w:numFmt w:val="bullet"/>
+      <w:lvlText w:val="o"/>
+      <w:lvlJc w:val="left"/>
+      <w:pPr>
+        <w:ind w:left="3600" w:hanging="360"/>
+      </w:pPr>
+      <w:rPr>
+        <w:rFonts w:ascii="Courier New" w:hAnsi="Courier New" w:cs="Courier New" w:hint="default"/>
+      </w:rPr>
+    </w:lvl>
+    <w:lvl w:ilvl="5" w:tplc="04090005" w:tentative="1">
+      <w:start w:val="1"/>
+      <w:numFmt w:val="bullet"/>
+      <w:lvlText w:val=""/>
+      <w:lvlJc w:val="left"/>
+      <w:pPr>
+        <w:ind w:left="4320" w:hanging="360"/>
+      </w:pPr>
+      <w:rPr>
+        <w:rFonts w:ascii="Wingdings" w:hAnsi="Wingdings" w:hint="default"/>
+      </w:rPr>
+    </w:lvl>
+    <w:lvl w:ilvl="6" w:tplc="04090001" w:tentative="1">
+      <w:start w:val="1"/>
+      <w:numFmt w:val="bullet"/>
+      <w:lvlText w:val=""/>
+      <w:lvlJc w:val="left"/>
+      <w:pPr>
+        <w:ind w:left="5040" w:hanging="360"/>
+      </w:pPr>
+      <w:rPr>
+        <w:rFonts w:ascii="Symbol" w:hAnsi="Symbol" w:hint="default"/>
+      </w:rPr>
+    </w:lvl>
+    <w:lvl w:ilvl="7" w:tplc="04090003" w:tentative="1">
+      <w:start w:val="1"/>
+      <w:numFmt w:val="bullet"/>
+      <w:lvlText w:val="o"/>
+      <w:lvlJc w:val="left"/>
+      <w:pPr>
+        <w:ind w:left="5760" w:hanging="360"/>
+      </w:pPr>
+      <w:rPr>
+        <w:rFonts w:ascii="Courier New" w:hAnsi="Courier New" w:cs="Courier New" w:hint="default"/>
+      </w:rPr>
+    </w:lvl>
+    <w:lvl w:ilvl="8" w:tplc="04090005" w:tentative="1">
+      <w:start w:val="1"/>
+      <w:numFmt w:val="bullet"/>
+      <w:lvlText w:val=""/>
+      <w:lvlJc w:val="left"/>
+      <w:pPr>
+        <w:ind w:left="6480" w:hanging="360"/>
+      </w:pPr>
+      <w:rPr>
+        <w:rFonts w:ascii="Wingdings" w:hAnsi="Wingdings" w:hint="default"/>
+      </w:rPr>
+    </w:lvl>
+  </w:abstractNum>
   <w:num w:numId="1" w16cid:durableId="373239229">
+    <w:abstractNumId w:val="9"/>
+  </w:num>
+  <w:num w:numId="2" w16cid:durableId="1643535309">
+    <w:abstractNumId w:val="8"/>
+  </w:num>
+  <w:num w:numId="3" w16cid:durableId="1276476286">
     <w:abstractNumId w:val="4"/>
   </w:num>
-  <w:num w:numId="2" w16cid:durableId="1643535309">
+  <w:num w:numId="4" w16cid:durableId="480078509">
+    <w:abstractNumId w:val="7"/>
+  </w:num>
+  <w:num w:numId="5" w16cid:durableId="1187257295">
+    <w:abstractNumId w:val="5"/>
+  </w:num>
+  <w:num w:numId="6" w16cid:durableId="610362165">
+    <w:abstractNumId w:val="2"/>
+  </w:num>
+  <w:num w:numId="7" w16cid:durableId="43332477">
+    <w:abstractNumId w:val="12"/>
+  </w:num>
+  <w:num w:numId="8" w16cid:durableId="1795515127">
+    <w:abstractNumId w:val="11"/>
+  </w:num>
+  <w:num w:numId="9" w16cid:durableId="362707469">
+    <w:abstractNumId w:val="1"/>
+  </w:num>
+  <w:num w:numId="10" w16cid:durableId="1772624927">
+    <w:abstractNumId w:val="0"/>
+  </w:num>
+  <w:num w:numId="11" w16cid:durableId="1903902631">
     <w:abstractNumId w:val="3"/>
   </w:num>
-  <w:num w:numId="3" w16cid:durableId="1276476286">
-    <w:abstractNumId w:val="0"/>
+  <w:num w:numId="12" w16cid:durableId="511455340">
+    <w:abstractNumId w:val="10"/>
   </w:num>
-  <w:num w:numId="4" w16cid:durableId="480078509">
-    <w:abstractNumId w:val="2"/>
-  </w:num>
-  <w:num w:numId="5" w16cid:durableId="1187257295">
-    <w:abstractNumId w:val="1"/>
+  <w:num w:numId="13" w16cid:durableId="200098994">
+    <w:abstractNumId w:val="6"/>
   </w:num>
 </w:numbering>
 </file>

</xml_diff>